<commit_message>
:tada: Add OSPF multizone :tada:
</commit_message>
<xml_diff>
--- a/cisco-commands.docx
+++ b/cisco-commands.docx
@@ -62,7 +62,7 @@
           <w:r>
             <w:fldChar w:fldCharType="separate"/>
           </w:r>
-          <w:hyperlink w:anchor="_Toc223597166" w:history="1">
+          <w:hyperlink w:anchor="_Toc223795628" w:history="1">
             <w:r>
               <w:rPr>
                 <w:rStyle w:val="Lienhypertexte"/>
@@ -89,7 +89,7 @@
                 <w:noProof/>
                 <w:webHidden/>
               </w:rPr>
-              <w:instrText xml:space="preserve"> PAGEREF _Toc223597166 \h </w:instrText>
+              <w:instrText xml:space="preserve"> PAGEREF _Toc223795628 \h </w:instrText>
             </w:r>
             <w:r>
               <w:rPr>
@@ -136,7 +136,7 @@
               <w14:ligatures w14:val="standardContextual"/>
             </w:rPr>
           </w:pPr>
-          <w:hyperlink w:anchor="_Toc223597167" w:history="1">
+          <w:hyperlink w:anchor="_Toc223795629" w:history="1">
             <w:r>
               <w:rPr>
                 <w:rStyle w:val="Lienhypertexte"/>
@@ -163,7 +163,7 @@
                 <w:noProof/>
                 <w:webHidden/>
               </w:rPr>
-              <w:instrText xml:space="preserve"> PAGEREF _Toc223597167 \h </w:instrText>
+              <w:instrText xml:space="preserve"> PAGEREF _Toc223795629 \h </w:instrText>
             </w:r>
             <w:r>
               <w:rPr>
@@ -210,7 +210,7 @@
               <w14:ligatures w14:val="standardContextual"/>
             </w:rPr>
           </w:pPr>
-          <w:hyperlink w:anchor="_Toc223597168" w:history="1">
+          <w:hyperlink w:anchor="_Toc223795630" w:history="1">
             <w:r>
               <w:rPr>
                 <w:rStyle w:val="Lienhypertexte"/>
@@ -237,7 +237,7 @@
                 <w:noProof/>
                 <w:webHidden/>
               </w:rPr>
-              <w:instrText xml:space="preserve"> PAGEREF _Toc223597168 \h </w:instrText>
+              <w:instrText xml:space="preserve"> PAGEREF _Toc223795630 \h </w:instrText>
             </w:r>
             <w:r>
               <w:rPr>
@@ -284,7 +284,7 @@
               <w14:ligatures w14:val="standardContextual"/>
             </w:rPr>
           </w:pPr>
-          <w:hyperlink w:anchor="_Toc223597169" w:history="1">
+          <w:hyperlink w:anchor="_Toc223795631" w:history="1">
             <w:r>
               <w:rPr>
                 <w:rStyle w:val="Lienhypertexte"/>
@@ -311,7 +311,7 @@
                 <w:noProof/>
                 <w:webHidden/>
               </w:rPr>
-              <w:instrText xml:space="preserve"> PAGEREF _Toc223597169 \h </w:instrText>
+              <w:instrText xml:space="preserve"> PAGEREF _Toc223795631 \h </w:instrText>
             </w:r>
             <w:r>
               <w:rPr>
@@ -358,7 +358,7 @@
               <w14:ligatures w14:val="standardContextual"/>
             </w:rPr>
           </w:pPr>
-          <w:hyperlink w:anchor="_Toc223597170" w:history="1">
+          <w:hyperlink w:anchor="_Toc223795632" w:history="1">
             <w:r>
               <w:rPr>
                 <w:rStyle w:val="Lienhypertexte"/>
@@ -385,7 +385,7 @@
                 <w:noProof/>
                 <w:webHidden/>
               </w:rPr>
-              <w:instrText xml:space="preserve"> PAGEREF _Toc223597170 \h </w:instrText>
+              <w:instrText xml:space="preserve"> PAGEREF _Toc223795632 \h </w:instrText>
             </w:r>
             <w:r>
               <w:rPr>
@@ -432,7 +432,7 @@
               <w14:ligatures w14:val="standardContextual"/>
             </w:rPr>
           </w:pPr>
-          <w:hyperlink w:anchor="_Toc223597171" w:history="1">
+          <w:hyperlink w:anchor="_Toc223795633" w:history="1">
             <w:r>
               <w:rPr>
                 <w:rStyle w:val="Lienhypertexte"/>
@@ -459,7 +459,7 @@
                 <w:noProof/>
                 <w:webHidden/>
               </w:rPr>
-              <w:instrText xml:space="preserve"> PAGEREF _Toc223597171 \h </w:instrText>
+              <w:instrText xml:space="preserve"> PAGEREF _Toc223795633 \h </w:instrText>
             </w:r>
             <w:r>
               <w:rPr>
@@ -506,7 +506,7 @@
               <w14:ligatures w14:val="standardContextual"/>
             </w:rPr>
           </w:pPr>
-          <w:hyperlink w:anchor="_Toc223597172" w:history="1">
+          <w:hyperlink w:anchor="_Toc223795634" w:history="1">
             <w:r>
               <w:rPr>
                 <w:rStyle w:val="Lienhypertexte"/>
@@ -533,7 +533,7 @@
                 <w:noProof/>
                 <w:webHidden/>
               </w:rPr>
-              <w:instrText xml:space="preserve"> PAGEREF _Toc223597172 \h </w:instrText>
+              <w:instrText xml:space="preserve"> PAGEREF _Toc223795634 \h </w:instrText>
             </w:r>
             <w:r>
               <w:rPr>
@@ -580,7 +580,7 @@
               <w14:ligatures w14:val="standardContextual"/>
             </w:rPr>
           </w:pPr>
-          <w:hyperlink w:anchor="_Toc223597173" w:history="1">
+          <w:hyperlink w:anchor="_Toc223795635" w:history="1">
             <w:r>
               <w:rPr>
                 <w:rStyle w:val="Lienhypertexte"/>
@@ -607,7 +607,7 @@
                 <w:noProof/>
                 <w:webHidden/>
               </w:rPr>
-              <w:instrText xml:space="preserve"> PAGEREF _Toc223597173 \h </w:instrText>
+              <w:instrText xml:space="preserve"> PAGEREF _Toc223795635 \h </w:instrText>
             </w:r>
             <w:r>
               <w:rPr>
@@ -654,7 +654,7 @@
               <w14:ligatures w14:val="standardContextual"/>
             </w:rPr>
           </w:pPr>
-          <w:hyperlink w:anchor="_Toc223597174" w:history="1">
+          <w:hyperlink w:anchor="_Toc223795636" w:history="1">
             <w:r>
               <w:rPr>
                 <w:rStyle w:val="Lienhypertexte"/>
@@ -681,7 +681,7 @@
                 <w:noProof/>
                 <w:webHidden/>
               </w:rPr>
-              <w:instrText xml:space="preserve"> PAGEREF _Toc223597174 \h </w:instrText>
+              <w:instrText xml:space="preserve"> PAGEREF _Toc223795636 \h </w:instrText>
             </w:r>
             <w:r>
               <w:rPr>
@@ -728,7 +728,7 @@
               <w14:ligatures w14:val="standardContextual"/>
             </w:rPr>
           </w:pPr>
-          <w:hyperlink w:anchor="_Toc223597175" w:history="1">
+          <w:hyperlink w:anchor="_Toc223795637" w:history="1">
             <w:r>
               <w:rPr>
                 <w:rStyle w:val="Lienhypertexte"/>
@@ -756,7 +756,7 @@
                 <w:noProof/>
                 <w:webHidden/>
               </w:rPr>
-              <w:instrText xml:space="preserve"> PAGEREF _Toc223597175 \h </w:instrText>
+              <w:instrText xml:space="preserve"> PAGEREF _Toc223795637 \h </w:instrText>
             </w:r>
             <w:r>
               <w:rPr>
@@ -803,7 +803,7 @@
               <w14:ligatures w14:val="standardContextual"/>
             </w:rPr>
           </w:pPr>
-          <w:hyperlink w:anchor="_Toc223597176" w:history="1">
+          <w:hyperlink w:anchor="_Toc223795638" w:history="1">
             <w:r>
               <w:rPr>
                 <w:rStyle w:val="Lienhypertexte"/>
@@ -831,7 +831,7 @@
                 <w:noProof/>
                 <w:webHidden/>
               </w:rPr>
-              <w:instrText xml:space="preserve"> PAGEREF _Toc223597176 \h </w:instrText>
+              <w:instrText xml:space="preserve"> PAGEREF _Toc223795638 \h </w:instrText>
             </w:r>
             <w:r>
               <w:rPr>
@@ -878,7 +878,7 @@
               <w14:ligatures w14:val="standardContextual"/>
             </w:rPr>
           </w:pPr>
-          <w:hyperlink w:anchor="_Toc223597177" w:history="1">
+          <w:hyperlink w:anchor="_Toc223795639" w:history="1">
             <w:r>
               <w:rPr>
                 <w:rStyle w:val="Lienhypertexte"/>
@@ -906,7 +906,7 @@
                 <w:noProof/>
                 <w:webHidden/>
               </w:rPr>
-              <w:instrText xml:space="preserve"> PAGEREF _Toc223597177 \h </w:instrText>
+              <w:instrText xml:space="preserve"> PAGEREF _Toc223795639 \h </w:instrText>
             </w:r>
             <w:r>
               <w:rPr>
@@ -953,7 +953,7 @@
               <w14:ligatures w14:val="standardContextual"/>
             </w:rPr>
           </w:pPr>
-          <w:hyperlink w:anchor="_Toc223597178" w:history="1">
+          <w:hyperlink w:anchor="_Toc223795640" w:history="1">
             <w:r>
               <w:rPr>
                 <w:rStyle w:val="Lienhypertexte"/>
@@ -980,7 +980,7 @@
                 <w:noProof/>
                 <w:webHidden/>
               </w:rPr>
-              <w:instrText xml:space="preserve"> PAGEREF _Toc223597178 \h </w:instrText>
+              <w:instrText xml:space="preserve"> PAGEREF _Toc223795640 \h </w:instrText>
             </w:r>
             <w:r>
               <w:rPr>
@@ -1027,7 +1027,7 @@
               <w14:ligatures w14:val="standardContextual"/>
             </w:rPr>
           </w:pPr>
-          <w:hyperlink w:anchor="_Toc223597179" w:history="1">
+          <w:hyperlink w:anchor="_Toc223795641" w:history="1">
             <w:r>
               <w:rPr>
                 <w:rStyle w:val="Lienhypertexte"/>
@@ -1055,7 +1055,7 @@
                 <w:noProof/>
                 <w:webHidden/>
               </w:rPr>
-              <w:instrText xml:space="preserve"> PAGEREF _Toc223597179 \h </w:instrText>
+              <w:instrText xml:space="preserve"> PAGEREF _Toc223795641 \h </w:instrText>
             </w:r>
             <w:r>
               <w:rPr>
@@ -1102,7 +1102,7 @@
               <w14:ligatures w14:val="standardContextual"/>
             </w:rPr>
           </w:pPr>
-          <w:hyperlink w:anchor="_Toc223597180" w:history="1">
+          <w:hyperlink w:anchor="_Toc223795642" w:history="1">
             <w:r>
               <w:rPr>
                 <w:rStyle w:val="Lienhypertexte"/>
@@ -1129,7 +1129,7 @@
                 <w:noProof/>
                 <w:webHidden/>
               </w:rPr>
-              <w:instrText xml:space="preserve"> PAGEREF _Toc223597180 \h </w:instrText>
+              <w:instrText xml:space="preserve"> PAGEREF _Toc223795642 \h </w:instrText>
             </w:r>
             <w:r>
               <w:rPr>
@@ -1176,7 +1176,7 @@
               <w14:ligatures w14:val="standardContextual"/>
             </w:rPr>
           </w:pPr>
-          <w:hyperlink w:anchor="_Toc223597181" w:history="1">
+          <w:hyperlink w:anchor="_Toc223795643" w:history="1">
             <w:r>
               <w:rPr>
                 <w:rStyle w:val="Lienhypertexte"/>
@@ -1203,7 +1203,7 @@
                 <w:noProof/>
                 <w:webHidden/>
               </w:rPr>
-              <w:instrText xml:space="preserve"> PAGEREF _Toc223597181 \h </w:instrText>
+              <w:instrText xml:space="preserve"> PAGEREF _Toc223795643 \h </w:instrText>
             </w:r>
             <w:r>
               <w:rPr>
@@ -1250,7 +1250,7 @@
               <w14:ligatures w14:val="standardContextual"/>
             </w:rPr>
           </w:pPr>
-          <w:hyperlink w:anchor="_Toc223597182" w:history="1">
+          <w:hyperlink w:anchor="_Toc223795644" w:history="1">
             <w:r>
               <w:rPr>
                 <w:rStyle w:val="Lienhypertexte"/>
@@ -1278,7 +1278,7 @@
                 <w:noProof/>
                 <w:webHidden/>
               </w:rPr>
-              <w:instrText xml:space="preserve"> PAGEREF _Toc223597182 \h </w:instrText>
+              <w:instrText xml:space="preserve"> PAGEREF _Toc223795644 \h </w:instrText>
             </w:r>
             <w:r>
               <w:rPr>
@@ -1299,6 +1299,538 @@
                 <w:webHidden/>
               </w:rPr>
               <w:t>7</w:t>
+            </w:r>
+            <w:r>
+              <w:rPr>
+                <w:noProof/>
+                <w:webHidden/>
+              </w:rPr>
+              <w:fldChar w:fldCharType="end"/>
+            </w:r>
+          </w:hyperlink>
+        </w:p>
+        <w:p>
+          <w:pPr>
+            <w:pStyle w:val="TM2"/>
+            <w:tabs>
+              <w:tab w:val="right" w:leader="dot" w:pos="9062"/>
+            </w:tabs>
+            <w:rPr>
+              <w:rFonts w:eastAsiaTheme="minorEastAsia"/>
+              <w:noProof/>
+              <w:kern w:val="2"/>
+              <w:sz w:val="24"/>
+              <w:szCs w:val="24"/>
+              <w:lang w:val="fr-BE" w:eastAsia="fr-BE"/>
+              <w14:ligatures w14:val="standardContextual"/>
+            </w:rPr>
+          </w:pPr>
+          <w:hyperlink w:anchor="_Toc223795645" w:history="1">
+            <w:r>
+              <w:rPr>
+                <w:rStyle w:val="Lienhypertexte"/>
+                <w:noProof/>
+              </w:rPr>
+              <w:t>Summarize on ABR</w:t>
+            </w:r>
+            <w:r>
+              <w:rPr>
+                <w:noProof/>
+                <w:webHidden/>
+              </w:rPr>
+              <w:tab/>
+            </w:r>
+            <w:r>
+              <w:rPr>
+                <w:noProof/>
+                <w:webHidden/>
+              </w:rPr>
+              <w:fldChar w:fldCharType="begin"/>
+            </w:r>
+            <w:r>
+              <w:rPr>
+                <w:noProof/>
+                <w:webHidden/>
+              </w:rPr>
+              <w:instrText xml:space="preserve"> PAGEREF _Toc223795645 \h </w:instrText>
+            </w:r>
+            <w:r>
+              <w:rPr>
+                <w:noProof/>
+                <w:webHidden/>
+              </w:rPr>
+            </w:r>
+            <w:r>
+              <w:rPr>
+                <w:noProof/>
+                <w:webHidden/>
+              </w:rPr>
+              <w:fldChar w:fldCharType="separate"/>
+            </w:r>
+            <w:r>
+              <w:rPr>
+                <w:noProof/>
+                <w:webHidden/>
+              </w:rPr>
+              <w:t>7</w:t>
+            </w:r>
+            <w:r>
+              <w:rPr>
+                <w:noProof/>
+                <w:webHidden/>
+              </w:rPr>
+              <w:fldChar w:fldCharType="end"/>
+            </w:r>
+          </w:hyperlink>
+        </w:p>
+        <w:p>
+          <w:pPr>
+            <w:pStyle w:val="TM2"/>
+            <w:tabs>
+              <w:tab w:val="right" w:leader="dot" w:pos="9062"/>
+            </w:tabs>
+            <w:rPr>
+              <w:rFonts w:eastAsiaTheme="minorEastAsia"/>
+              <w:noProof/>
+              <w:kern w:val="2"/>
+              <w:sz w:val="24"/>
+              <w:szCs w:val="24"/>
+              <w:lang w:val="fr-BE" w:eastAsia="fr-BE"/>
+              <w14:ligatures w14:val="standardContextual"/>
+            </w:rPr>
+          </w:pPr>
+          <w:hyperlink w:anchor="_Toc223795646" w:history="1">
+            <w:r>
+              <w:rPr>
+                <w:rStyle w:val="Lienhypertexte"/>
+                <w:noProof/>
+              </w:rPr>
+              <w:t>Summarize on ASBR</w:t>
+            </w:r>
+            <w:r>
+              <w:rPr>
+                <w:noProof/>
+                <w:webHidden/>
+              </w:rPr>
+              <w:tab/>
+            </w:r>
+            <w:r>
+              <w:rPr>
+                <w:noProof/>
+                <w:webHidden/>
+              </w:rPr>
+              <w:fldChar w:fldCharType="begin"/>
+            </w:r>
+            <w:r>
+              <w:rPr>
+                <w:noProof/>
+                <w:webHidden/>
+              </w:rPr>
+              <w:instrText xml:space="preserve"> PAGEREF _Toc223795646 \h </w:instrText>
+            </w:r>
+            <w:r>
+              <w:rPr>
+                <w:noProof/>
+                <w:webHidden/>
+              </w:rPr>
+            </w:r>
+            <w:r>
+              <w:rPr>
+                <w:noProof/>
+                <w:webHidden/>
+              </w:rPr>
+              <w:fldChar w:fldCharType="separate"/>
+            </w:r>
+            <w:r>
+              <w:rPr>
+                <w:noProof/>
+                <w:webHidden/>
+              </w:rPr>
+              <w:t>7</w:t>
+            </w:r>
+            <w:r>
+              <w:rPr>
+                <w:noProof/>
+                <w:webHidden/>
+              </w:rPr>
+              <w:fldChar w:fldCharType="end"/>
+            </w:r>
+          </w:hyperlink>
+        </w:p>
+        <w:p>
+          <w:pPr>
+            <w:pStyle w:val="TM2"/>
+            <w:tabs>
+              <w:tab w:val="right" w:leader="dot" w:pos="9062"/>
+            </w:tabs>
+            <w:rPr>
+              <w:rFonts w:eastAsiaTheme="minorEastAsia"/>
+              <w:noProof/>
+              <w:kern w:val="2"/>
+              <w:sz w:val="24"/>
+              <w:szCs w:val="24"/>
+              <w:lang w:val="fr-BE" w:eastAsia="fr-BE"/>
+              <w14:ligatures w14:val="standardContextual"/>
+            </w:rPr>
+          </w:pPr>
+          <w:hyperlink w:anchor="_Toc223795647" w:history="1">
+            <w:r>
+              <w:rPr>
+                <w:rStyle w:val="Lienhypertexte"/>
+                <w:noProof/>
+              </w:rPr>
+              <w:t>Virtual link</w:t>
+            </w:r>
+            <w:r>
+              <w:rPr>
+                <w:noProof/>
+                <w:webHidden/>
+              </w:rPr>
+              <w:tab/>
+            </w:r>
+            <w:r>
+              <w:rPr>
+                <w:noProof/>
+                <w:webHidden/>
+              </w:rPr>
+              <w:fldChar w:fldCharType="begin"/>
+            </w:r>
+            <w:r>
+              <w:rPr>
+                <w:noProof/>
+                <w:webHidden/>
+              </w:rPr>
+              <w:instrText xml:space="preserve"> PAGEREF _Toc223795647 \h </w:instrText>
+            </w:r>
+            <w:r>
+              <w:rPr>
+                <w:noProof/>
+                <w:webHidden/>
+              </w:rPr>
+            </w:r>
+            <w:r>
+              <w:rPr>
+                <w:noProof/>
+                <w:webHidden/>
+              </w:rPr>
+              <w:fldChar w:fldCharType="separate"/>
+            </w:r>
+            <w:r>
+              <w:rPr>
+                <w:noProof/>
+                <w:webHidden/>
+              </w:rPr>
+              <w:t>8</w:t>
+            </w:r>
+            <w:r>
+              <w:rPr>
+                <w:noProof/>
+                <w:webHidden/>
+              </w:rPr>
+              <w:fldChar w:fldCharType="end"/>
+            </w:r>
+          </w:hyperlink>
+        </w:p>
+        <w:p>
+          <w:pPr>
+            <w:pStyle w:val="TM2"/>
+            <w:tabs>
+              <w:tab w:val="right" w:leader="dot" w:pos="9062"/>
+            </w:tabs>
+            <w:rPr>
+              <w:rFonts w:eastAsiaTheme="minorEastAsia"/>
+              <w:noProof/>
+              <w:kern w:val="2"/>
+              <w:sz w:val="24"/>
+              <w:szCs w:val="24"/>
+              <w:lang w:val="fr-BE" w:eastAsia="fr-BE"/>
+              <w14:ligatures w14:val="standardContextual"/>
+            </w:rPr>
+          </w:pPr>
+          <w:hyperlink w:anchor="_Toc223795648" w:history="1">
+            <w:r>
+              <w:rPr>
+                <w:rStyle w:val="Lienhypertexte"/>
+                <w:noProof/>
+              </w:rPr>
+              <w:t>Stub area</w:t>
+            </w:r>
+            <w:r>
+              <w:rPr>
+                <w:noProof/>
+                <w:webHidden/>
+              </w:rPr>
+              <w:tab/>
+            </w:r>
+            <w:r>
+              <w:rPr>
+                <w:noProof/>
+                <w:webHidden/>
+              </w:rPr>
+              <w:fldChar w:fldCharType="begin"/>
+            </w:r>
+            <w:r>
+              <w:rPr>
+                <w:noProof/>
+                <w:webHidden/>
+              </w:rPr>
+              <w:instrText xml:space="preserve"> PAGEREF _Toc223795648 \h </w:instrText>
+            </w:r>
+            <w:r>
+              <w:rPr>
+                <w:noProof/>
+                <w:webHidden/>
+              </w:rPr>
+            </w:r>
+            <w:r>
+              <w:rPr>
+                <w:noProof/>
+                <w:webHidden/>
+              </w:rPr>
+              <w:fldChar w:fldCharType="separate"/>
+            </w:r>
+            <w:r>
+              <w:rPr>
+                <w:noProof/>
+                <w:webHidden/>
+              </w:rPr>
+              <w:t>8</w:t>
+            </w:r>
+            <w:r>
+              <w:rPr>
+                <w:noProof/>
+                <w:webHidden/>
+              </w:rPr>
+              <w:fldChar w:fldCharType="end"/>
+            </w:r>
+          </w:hyperlink>
+        </w:p>
+        <w:p>
+          <w:pPr>
+            <w:pStyle w:val="TM2"/>
+            <w:tabs>
+              <w:tab w:val="right" w:leader="dot" w:pos="9062"/>
+            </w:tabs>
+            <w:rPr>
+              <w:rFonts w:eastAsiaTheme="minorEastAsia"/>
+              <w:noProof/>
+              <w:kern w:val="2"/>
+              <w:sz w:val="24"/>
+              <w:szCs w:val="24"/>
+              <w:lang w:val="fr-BE" w:eastAsia="fr-BE"/>
+              <w14:ligatures w14:val="standardContextual"/>
+            </w:rPr>
+          </w:pPr>
+          <w:hyperlink w:anchor="_Toc223795649" w:history="1">
+            <w:r>
+              <w:rPr>
+                <w:rStyle w:val="Lienhypertexte"/>
+                <w:noProof/>
+              </w:rPr>
+              <w:t>Totally stubby area</w:t>
+            </w:r>
+            <w:r>
+              <w:rPr>
+                <w:noProof/>
+                <w:webHidden/>
+              </w:rPr>
+              <w:tab/>
+            </w:r>
+            <w:r>
+              <w:rPr>
+                <w:noProof/>
+                <w:webHidden/>
+              </w:rPr>
+              <w:fldChar w:fldCharType="begin"/>
+            </w:r>
+            <w:r>
+              <w:rPr>
+                <w:noProof/>
+                <w:webHidden/>
+              </w:rPr>
+              <w:instrText xml:space="preserve"> PAGEREF _Toc223795649 \h </w:instrText>
+            </w:r>
+            <w:r>
+              <w:rPr>
+                <w:noProof/>
+                <w:webHidden/>
+              </w:rPr>
+            </w:r>
+            <w:r>
+              <w:rPr>
+                <w:noProof/>
+                <w:webHidden/>
+              </w:rPr>
+              <w:fldChar w:fldCharType="separate"/>
+            </w:r>
+            <w:r>
+              <w:rPr>
+                <w:noProof/>
+                <w:webHidden/>
+              </w:rPr>
+              <w:t>8</w:t>
+            </w:r>
+            <w:r>
+              <w:rPr>
+                <w:noProof/>
+                <w:webHidden/>
+              </w:rPr>
+              <w:fldChar w:fldCharType="end"/>
+            </w:r>
+          </w:hyperlink>
+        </w:p>
+        <w:p>
+          <w:pPr>
+            <w:pStyle w:val="TM2"/>
+            <w:tabs>
+              <w:tab w:val="right" w:leader="dot" w:pos="9062"/>
+            </w:tabs>
+            <w:rPr>
+              <w:rFonts w:eastAsiaTheme="minorEastAsia"/>
+              <w:noProof/>
+              <w:kern w:val="2"/>
+              <w:sz w:val="24"/>
+              <w:szCs w:val="24"/>
+              <w:lang w:val="fr-BE" w:eastAsia="fr-BE"/>
+              <w14:ligatures w14:val="standardContextual"/>
+            </w:rPr>
+          </w:pPr>
+          <w:hyperlink w:anchor="_Toc223795650" w:history="1">
+            <w:r>
+              <w:rPr>
+                <w:rStyle w:val="Lienhypertexte"/>
+                <w:noProof/>
+              </w:rPr>
+              <w:t>NS</w:t>
+            </w:r>
+            <w:r>
+              <w:rPr>
+                <w:rStyle w:val="Lienhypertexte"/>
+                <w:noProof/>
+              </w:rPr>
+              <w:t>S</w:t>
+            </w:r>
+            <w:r>
+              <w:rPr>
+                <w:rStyle w:val="Lienhypertexte"/>
+                <w:noProof/>
+              </w:rPr>
+              <w:t>A area</w:t>
+            </w:r>
+            <w:r>
+              <w:rPr>
+                <w:noProof/>
+                <w:webHidden/>
+              </w:rPr>
+              <w:tab/>
+            </w:r>
+            <w:r>
+              <w:rPr>
+                <w:noProof/>
+                <w:webHidden/>
+              </w:rPr>
+              <w:fldChar w:fldCharType="begin"/>
+            </w:r>
+            <w:r>
+              <w:rPr>
+                <w:noProof/>
+                <w:webHidden/>
+              </w:rPr>
+              <w:instrText xml:space="preserve"> PAGEREF _Toc223795650 \h </w:instrText>
+            </w:r>
+            <w:r>
+              <w:rPr>
+                <w:noProof/>
+                <w:webHidden/>
+              </w:rPr>
+            </w:r>
+            <w:r>
+              <w:rPr>
+                <w:noProof/>
+                <w:webHidden/>
+              </w:rPr>
+              <w:fldChar w:fldCharType="separate"/>
+            </w:r>
+            <w:r>
+              <w:rPr>
+                <w:noProof/>
+                <w:webHidden/>
+              </w:rPr>
+              <w:t>8</w:t>
+            </w:r>
+            <w:r>
+              <w:rPr>
+                <w:noProof/>
+                <w:webHidden/>
+              </w:rPr>
+              <w:fldChar w:fldCharType="end"/>
+            </w:r>
+          </w:hyperlink>
+        </w:p>
+        <w:p>
+          <w:pPr>
+            <w:pStyle w:val="TM2"/>
+            <w:tabs>
+              <w:tab w:val="right" w:leader="dot" w:pos="9062"/>
+            </w:tabs>
+            <w:rPr>
+              <w:rFonts w:eastAsiaTheme="minorEastAsia"/>
+              <w:noProof/>
+              <w:kern w:val="2"/>
+              <w:sz w:val="24"/>
+              <w:szCs w:val="24"/>
+              <w:lang w:val="fr-BE" w:eastAsia="fr-BE"/>
+              <w14:ligatures w14:val="standardContextual"/>
+            </w:rPr>
+          </w:pPr>
+          <w:hyperlink w:anchor="_Toc223795651" w:history="1">
+            <w:r>
+              <w:rPr>
+                <w:rStyle w:val="Lienhypertexte"/>
+                <w:noProof/>
+              </w:rPr>
+              <w:t>Totally NSSA area</w:t>
+            </w:r>
+            <w:r>
+              <w:rPr>
+                <w:noProof/>
+                <w:webHidden/>
+              </w:rPr>
+              <w:tab/>
+            </w:r>
+            <w:r>
+              <w:rPr>
+                <w:noProof/>
+                <w:webHidden/>
+              </w:rPr>
+              <w:fldChar w:fldCharType="begin"/>
+            </w:r>
+            <w:r>
+              <w:rPr>
+                <w:noProof/>
+                <w:webHidden/>
+              </w:rPr>
+              <w:instrText xml:space="preserve"> PAGEREF _Toc223795651 \h </w:instrText>
+            </w:r>
+            <w:r>
+              <w:rPr>
+                <w:noProof/>
+                <w:webHidden/>
+              </w:rPr>
+            </w:r>
+            <w:r>
+              <w:rPr>
+                <w:noProof/>
+                <w:webHidden/>
+              </w:rPr>
+              <w:fldChar w:fldCharType="separate"/>
+            </w:r>
+            <w:r>
+              <w:rPr>
+                <w:noProof/>
+                <w:webHidden/>
+              </w:rPr>
+              <w:t>8</w:t>
             </w:r>
             <w:r>
               <w:rPr>
@@ -1325,7 +1857,7 @@
               <w14:ligatures w14:val="standardContextual"/>
             </w:rPr>
           </w:pPr>
-          <w:hyperlink w:anchor="_Toc223597183" w:history="1">
+          <w:hyperlink w:anchor="_Toc223795652" w:history="1">
             <w:r>
               <w:rPr>
                 <w:rStyle w:val="Lienhypertexte"/>
@@ -1352,7 +1884,7 @@
                 <w:noProof/>
                 <w:webHidden/>
               </w:rPr>
-              <w:instrText xml:space="preserve"> PAGEREF _Toc223597183 \h </w:instrText>
+              <w:instrText xml:space="preserve"> PAGEREF _Toc223795652 \h </w:instrText>
             </w:r>
             <w:r>
               <w:rPr>
@@ -1372,7 +1904,7 @@
                 <w:noProof/>
                 <w:webHidden/>
               </w:rPr>
-              <w:t>8</w:t>
+              <w:t>10</w:t>
             </w:r>
             <w:r>
               <w:rPr>
@@ -1399,7 +1931,7 @@
               <w14:ligatures w14:val="standardContextual"/>
             </w:rPr>
           </w:pPr>
-          <w:hyperlink w:anchor="_Toc223597184" w:history="1">
+          <w:hyperlink w:anchor="_Toc223795653" w:history="1">
             <w:r>
               <w:rPr>
                 <w:rStyle w:val="Lienhypertexte"/>
@@ -1426,7 +1958,7 @@
                 <w:noProof/>
                 <w:webHidden/>
               </w:rPr>
-              <w:instrText xml:space="preserve"> PAGEREF _Toc223597184 \h </w:instrText>
+              <w:instrText xml:space="preserve"> PAGEREF _Toc223795653 \h </w:instrText>
             </w:r>
             <w:r>
               <w:rPr>
@@ -1446,7 +1978,7 @@
                 <w:noProof/>
                 <w:webHidden/>
               </w:rPr>
-              <w:t>8</w:t>
+              <w:t>10</w:t>
             </w:r>
             <w:r>
               <w:rPr>
@@ -1473,7 +2005,7 @@
               <w14:ligatures w14:val="standardContextual"/>
             </w:rPr>
           </w:pPr>
-          <w:hyperlink w:anchor="_Toc223597185" w:history="1">
+          <w:hyperlink w:anchor="_Toc223795654" w:history="1">
             <w:r>
               <w:rPr>
                 <w:rStyle w:val="Lienhypertexte"/>
@@ -1501,7 +2033,7 @@
                 <w:noProof/>
                 <w:webHidden/>
               </w:rPr>
-              <w:instrText xml:space="preserve"> PAGEREF _Toc223597185 \h </w:instrText>
+              <w:instrText xml:space="preserve"> PAGEREF _Toc223795654 \h </w:instrText>
             </w:r>
             <w:r>
               <w:rPr>
@@ -1521,7 +2053,7 @@
                 <w:noProof/>
                 <w:webHidden/>
               </w:rPr>
-              <w:t>8</w:t>
+              <w:t>10</w:t>
             </w:r>
             <w:r>
               <w:rPr>
@@ -1548,7 +2080,7 @@
               <w14:ligatures w14:val="standardContextual"/>
             </w:rPr>
           </w:pPr>
-          <w:hyperlink w:anchor="_Toc223597186" w:history="1">
+          <w:hyperlink w:anchor="_Toc223795655" w:history="1">
             <w:r>
               <w:rPr>
                 <w:rStyle w:val="Lienhypertexte"/>
@@ -1575,7 +2107,7 @@
                 <w:noProof/>
                 <w:webHidden/>
               </w:rPr>
-              <w:instrText xml:space="preserve"> PAGEREF _Toc223597186 \h </w:instrText>
+              <w:instrText xml:space="preserve"> PAGEREF _Toc223795655 \h </w:instrText>
             </w:r>
             <w:r>
               <w:rPr>
@@ -1595,7 +2127,7 @@
                 <w:noProof/>
                 <w:webHidden/>
               </w:rPr>
-              <w:t>9</w:t>
+              <w:t>11</w:t>
             </w:r>
             <w:r>
               <w:rPr>
@@ -1622,7 +2154,7 @@
               <w14:ligatures w14:val="standardContextual"/>
             </w:rPr>
           </w:pPr>
-          <w:hyperlink w:anchor="_Toc223597187" w:history="1">
+          <w:hyperlink w:anchor="_Toc223795656" w:history="1">
             <w:r>
               <w:rPr>
                 <w:rStyle w:val="Lienhypertexte"/>
@@ -1649,7 +2181,7 @@
                 <w:noProof/>
                 <w:webHidden/>
               </w:rPr>
-              <w:instrText xml:space="preserve"> PAGEREF _Toc223597187 \h </w:instrText>
+              <w:instrText xml:space="preserve"> PAGEREF _Toc223795656 \h </w:instrText>
             </w:r>
             <w:r>
               <w:rPr>
@@ -1669,7 +2201,7 @@
                 <w:noProof/>
                 <w:webHidden/>
               </w:rPr>
-              <w:t>10</w:t>
+              <w:t>12</w:t>
             </w:r>
             <w:r>
               <w:rPr>
@@ -1696,7 +2228,7 @@
               <w14:ligatures w14:val="standardContextual"/>
             </w:rPr>
           </w:pPr>
-          <w:hyperlink w:anchor="_Toc223597188" w:history="1">
+          <w:hyperlink w:anchor="_Toc223795657" w:history="1">
             <w:r>
               <w:rPr>
                 <w:rStyle w:val="Lienhypertexte"/>
@@ -1724,7 +2256,7 @@
                 <w:noProof/>
                 <w:webHidden/>
               </w:rPr>
-              <w:instrText xml:space="preserve"> PAGEREF _Toc223597188 \h </w:instrText>
+              <w:instrText xml:space="preserve"> PAGEREF _Toc223795657 \h </w:instrText>
             </w:r>
             <w:r>
               <w:rPr>
@@ -1744,7 +2276,7 @@
                 <w:noProof/>
                 <w:webHidden/>
               </w:rPr>
-              <w:t>12</w:t>
+              <w:t>14</w:t>
             </w:r>
             <w:r>
               <w:rPr>
@@ -1771,7 +2303,7 @@
               <w14:ligatures w14:val="standardContextual"/>
             </w:rPr>
           </w:pPr>
-          <w:hyperlink w:anchor="_Toc223597189" w:history="1">
+          <w:hyperlink w:anchor="_Toc223795658" w:history="1">
             <w:r>
               <w:rPr>
                 <w:rStyle w:val="Lienhypertexte"/>
@@ -1798,7 +2330,7 @@
                 <w:noProof/>
                 <w:webHidden/>
               </w:rPr>
-              <w:instrText xml:space="preserve"> PAGEREF _Toc223597189 \h </w:instrText>
+              <w:instrText xml:space="preserve"> PAGEREF _Toc223795658 \h </w:instrText>
             </w:r>
             <w:r>
               <w:rPr>
@@ -1818,7 +2350,7 @@
                 <w:noProof/>
                 <w:webHidden/>
               </w:rPr>
-              <w:t>12</w:t>
+              <w:t>14</w:t>
             </w:r>
             <w:r>
               <w:rPr>
@@ -1845,7 +2377,7 @@
               <w14:ligatures w14:val="standardContextual"/>
             </w:rPr>
           </w:pPr>
-          <w:hyperlink w:anchor="_Toc223597190" w:history="1">
+          <w:hyperlink w:anchor="_Toc223795659" w:history="1">
             <w:r>
               <w:rPr>
                 <w:rStyle w:val="Lienhypertexte"/>
@@ -1872,7 +2404,7 @@
                 <w:noProof/>
                 <w:webHidden/>
               </w:rPr>
-              <w:instrText xml:space="preserve"> PAGEREF _Toc223597190 \h </w:instrText>
+              <w:instrText xml:space="preserve"> PAGEREF _Toc223795659 \h </w:instrText>
             </w:r>
             <w:r>
               <w:rPr>
@@ -1892,7 +2424,7 @@
                 <w:noProof/>
                 <w:webHidden/>
               </w:rPr>
-              <w:t>12</w:t>
+              <w:t>14</w:t>
             </w:r>
             <w:r>
               <w:rPr>
@@ -1919,7 +2451,7 @@
               <w14:ligatures w14:val="standardContextual"/>
             </w:rPr>
           </w:pPr>
-          <w:hyperlink w:anchor="_Toc223597191" w:history="1">
+          <w:hyperlink w:anchor="_Toc223795660" w:history="1">
             <w:r>
               <w:rPr>
                 <w:rStyle w:val="Lienhypertexte"/>
@@ -1947,7 +2479,7 @@
                 <w:noProof/>
                 <w:webHidden/>
               </w:rPr>
-              <w:instrText xml:space="preserve"> PAGEREF _Toc223597191 \h </w:instrText>
+              <w:instrText xml:space="preserve"> PAGEREF _Toc223795660 \h </w:instrText>
             </w:r>
             <w:r>
               <w:rPr>
@@ -1967,7 +2499,7 @@
                 <w:noProof/>
                 <w:webHidden/>
               </w:rPr>
-              <w:t>13</w:t>
+              <w:t>15</w:t>
             </w:r>
             <w:r>
               <w:rPr>
@@ -1994,7 +2526,7 @@
               <w14:ligatures w14:val="standardContextual"/>
             </w:rPr>
           </w:pPr>
-          <w:hyperlink w:anchor="_Toc223597192" w:history="1">
+          <w:hyperlink w:anchor="_Toc223795661" w:history="1">
             <w:r>
               <w:rPr>
                 <w:rStyle w:val="Lienhypertexte"/>
@@ -2022,7 +2554,7 @@
                 <w:noProof/>
                 <w:webHidden/>
               </w:rPr>
-              <w:instrText xml:space="preserve"> PAGEREF _Toc223597192 \h </w:instrText>
+              <w:instrText xml:space="preserve"> PAGEREF _Toc223795661 \h </w:instrText>
             </w:r>
             <w:r>
               <w:rPr>
@@ -2042,7 +2574,7 @@
                 <w:noProof/>
                 <w:webHidden/>
               </w:rPr>
-              <w:t>13</w:t>
+              <w:t>15</w:t>
             </w:r>
             <w:r>
               <w:rPr>
@@ -2069,7 +2601,7 @@
               <w14:ligatures w14:val="standardContextual"/>
             </w:rPr>
           </w:pPr>
-          <w:hyperlink w:anchor="_Toc223597193" w:history="1">
+          <w:hyperlink w:anchor="_Toc223795662" w:history="1">
             <w:r>
               <w:rPr>
                 <w:rStyle w:val="Lienhypertexte"/>
@@ -2097,7 +2629,7 @@
                 <w:noProof/>
                 <w:webHidden/>
               </w:rPr>
-              <w:instrText xml:space="preserve"> PAGEREF _Toc223597193 \h </w:instrText>
+              <w:instrText xml:space="preserve"> PAGEREF _Toc223795662 \h </w:instrText>
             </w:r>
             <w:r>
               <w:rPr>
@@ -2117,7 +2649,7 @@
                 <w:noProof/>
                 <w:webHidden/>
               </w:rPr>
-              <w:t>13</w:t>
+              <w:t>15</w:t>
             </w:r>
             <w:r>
               <w:rPr>
@@ -2144,7 +2676,7 @@
               <w14:ligatures w14:val="standardContextual"/>
             </w:rPr>
           </w:pPr>
-          <w:hyperlink w:anchor="_Toc223597194" w:history="1">
+          <w:hyperlink w:anchor="_Toc223795663" w:history="1">
             <w:r>
               <w:rPr>
                 <w:rStyle w:val="Lienhypertexte"/>
@@ -2172,7 +2704,7 @@
                 <w:noProof/>
                 <w:webHidden/>
               </w:rPr>
-              <w:instrText xml:space="preserve"> PAGEREF _Toc223597194 \h </w:instrText>
+              <w:instrText xml:space="preserve"> PAGEREF _Toc223795663 \h </w:instrText>
             </w:r>
             <w:r>
               <w:rPr>
@@ -2192,7 +2724,7 @@
                 <w:noProof/>
                 <w:webHidden/>
               </w:rPr>
-              <w:t>14</w:t>
+              <w:t>16</w:t>
             </w:r>
             <w:r>
               <w:rPr>
@@ -2219,7 +2751,7 @@
               <w14:ligatures w14:val="standardContextual"/>
             </w:rPr>
           </w:pPr>
-          <w:hyperlink w:anchor="_Toc223597195" w:history="1">
+          <w:hyperlink w:anchor="_Toc223795664" w:history="1">
             <w:r>
               <w:rPr>
                 <w:rStyle w:val="Lienhypertexte"/>
@@ -2246,7 +2778,7 @@
                 <w:noProof/>
                 <w:webHidden/>
               </w:rPr>
-              <w:instrText xml:space="preserve"> PAGEREF _Toc223597195 \h </w:instrText>
+              <w:instrText xml:space="preserve"> PAGEREF _Toc223795664 \h </w:instrText>
             </w:r>
             <w:r>
               <w:rPr>
@@ -2266,7 +2798,7 @@
                 <w:noProof/>
                 <w:webHidden/>
               </w:rPr>
-              <w:t>15</w:t>
+              <w:t>17</w:t>
             </w:r>
             <w:r>
               <w:rPr>
@@ -2293,7 +2825,7 @@
               <w14:ligatures w14:val="standardContextual"/>
             </w:rPr>
           </w:pPr>
-          <w:hyperlink w:anchor="_Toc223597196" w:history="1">
+          <w:hyperlink w:anchor="_Toc223795665" w:history="1">
             <w:r>
               <w:rPr>
                 <w:rStyle w:val="Lienhypertexte"/>
@@ -2320,7 +2852,7 @@
                 <w:noProof/>
                 <w:webHidden/>
               </w:rPr>
-              <w:instrText xml:space="preserve"> PAGEREF _Toc223597196 \h </w:instrText>
+              <w:instrText xml:space="preserve"> PAGEREF _Toc223795665 \h </w:instrText>
             </w:r>
             <w:r>
               <w:rPr>
@@ -2340,7 +2872,7 @@
                 <w:noProof/>
                 <w:webHidden/>
               </w:rPr>
-              <w:t>15</w:t>
+              <w:t>17</w:t>
             </w:r>
             <w:r>
               <w:rPr>
@@ -2367,7 +2899,7 @@
               <w14:ligatures w14:val="standardContextual"/>
             </w:rPr>
           </w:pPr>
-          <w:hyperlink w:anchor="_Toc223597197" w:history="1">
+          <w:hyperlink w:anchor="_Toc223795666" w:history="1">
             <w:r>
               <w:rPr>
                 <w:rStyle w:val="Lienhypertexte"/>
@@ -2394,7 +2926,7 @@
                 <w:noProof/>
                 <w:webHidden/>
               </w:rPr>
-              <w:instrText xml:space="preserve"> PAGEREF _Toc223597197 \h </w:instrText>
+              <w:instrText xml:space="preserve"> PAGEREF _Toc223795666 \h </w:instrText>
             </w:r>
             <w:r>
               <w:rPr>
@@ -2414,7 +2946,7 @@
                 <w:noProof/>
                 <w:webHidden/>
               </w:rPr>
-              <w:t>15</w:t>
+              <w:t>17</w:t>
             </w:r>
             <w:r>
               <w:rPr>
@@ -2441,7 +2973,7 @@
               <w14:ligatures w14:val="standardContextual"/>
             </w:rPr>
           </w:pPr>
-          <w:hyperlink w:anchor="_Toc223597198" w:history="1">
+          <w:hyperlink w:anchor="_Toc223795667" w:history="1">
             <w:r>
               <w:rPr>
                 <w:rStyle w:val="Lienhypertexte"/>
@@ -2468,7 +3000,7 @@
                 <w:noProof/>
                 <w:webHidden/>
               </w:rPr>
-              <w:instrText xml:space="preserve"> PAGEREF _Toc223597198 \h </w:instrText>
+              <w:instrText xml:space="preserve"> PAGEREF _Toc223795667 \h </w:instrText>
             </w:r>
             <w:r>
               <w:rPr>
@@ -2488,7 +3020,7 @@
                 <w:noProof/>
                 <w:webHidden/>
               </w:rPr>
-              <w:t>16</w:t>
+              <w:t>18</w:t>
             </w:r>
             <w:r>
               <w:rPr>
@@ -2515,7 +3047,7 @@
               <w14:ligatures w14:val="standardContextual"/>
             </w:rPr>
           </w:pPr>
-          <w:hyperlink w:anchor="_Toc223597199" w:history="1">
+          <w:hyperlink w:anchor="_Toc223795668" w:history="1">
             <w:r>
               <w:rPr>
                 <w:rStyle w:val="Lienhypertexte"/>
@@ -2543,7 +3075,7 @@
                 <w:noProof/>
                 <w:webHidden/>
               </w:rPr>
-              <w:instrText xml:space="preserve"> PAGEREF _Toc223597199 \h </w:instrText>
+              <w:instrText xml:space="preserve"> PAGEREF _Toc223795668 \h </w:instrText>
             </w:r>
             <w:r>
               <w:rPr>
@@ -2563,7 +3095,7 @@
                 <w:noProof/>
                 <w:webHidden/>
               </w:rPr>
-              <w:t>16</w:t>
+              <w:t>18</w:t>
             </w:r>
             <w:r>
               <w:rPr>
@@ -2590,7 +3122,7 @@
               <w14:ligatures w14:val="standardContextual"/>
             </w:rPr>
           </w:pPr>
-          <w:hyperlink w:anchor="_Toc223597200" w:history="1">
+          <w:hyperlink w:anchor="_Toc223795669" w:history="1">
             <w:r>
               <w:rPr>
                 <w:rStyle w:val="Lienhypertexte"/>
@@ -2617,7 +3149,7 @@
                 <w:noProof/>
                 <w:webHidden/>
               </w:rPr>
-              <w:instrText xml:space="preserve"> PAGEREF _Toc223597200 \h </w:instrText>
+              <w:instrText xml:space="preserve"> PAGEREF _Toc223795669 \h </w:instrText>
             </w:r>
             <w:r>
               <w:rPr>
@@ -2637,7 +3169,7 @@
                 <w:noProof/>
                 <w:webHidden/>
               </w:rPr>
-              <w:t>17</w:t>
+              <w:t>19</w:t>
             </w:r>
             <w:r>
               <w:rPr>
@@ -2664,7 +3196,7 @@
               <w14:ligatures w14:val="standardContextual"/>
             </w:rPr>
           </w:pPr>
-          <w:hyperlink w:anchor="_Toc223597201" w:history="1">
+          <w:hyperlink w:anchor="_Toc223795670" w:history="1">
             <w:r>
               <w:rPr>
                 <w:rStyle w:val="Lienhypertexte"/>
@@ -2691,7 +3223,7 @@
                 <w:noProof/>
                 <w:webHidden/>
               </w:rPr>
-              <w:instrText xml:space="preserve"> PAGEREF _Toc223597201 \h </w:instrText>
+              <w:instrText xml:space="preserve"> PAGEREF _Toc223795670 \h </w:instrText>
             </w:r>
             <w:r>
               <w:rPr>
@@ -2711,7 +3243,7 @@
                 <w:noProof/>
                 <w:webHidden/>
               </w:rPr>
-              <w:t>18</w:t>
+              <w:t>20</w:t>
             </w:r>
             <w:r>
               <w:rPr>
@@ -2749,7 +3281,7 @@
       <w:pPr>
         <w:pStyle w:val="Titre1"/>
       </w:pPr>
-      <w:bookmarkStart w:id="0" w:name="_Toc223597166"/>
+      <w:bookmarkStart w:id="0" w:name="_Toc223795628"/>
       <w:r>
         <w:lastRenderedPageBreak/>
         <w:t>Basic Configurations</w:t>
@@ -2760,7 +3292,7 @@
       <w:pPr>
         <w:pStyle w:val="Titre2"/>
       </w:pPr>
-      <w:bookmarkStart w:id="1" w:name="_Toc223597167"/>
+      <w:bookmarkStart w:id="1" w:name="_Toc223795629"/>
       <w:r>
         <w:t>Hostname &amp; Security</w:t>
       </w:r>
@@ -2771,28 +3303,18 @@
         <w:rPr>
           <w:b/>
           <w:bCs/>
-          <w:lang w:val="fr-BE"/>
-        </w:rPr>
-      </w:pPr>
-      <w:r>
-        <w:rPr>
-          <w:b/>
-          <w:bCs/>
-          <w:lang w:val="fr-BE"/>
+        </w:rPr>
+      </w:pPr>
+      <w:r>
+        <w:rPr>
+          <w:b/>
+          <w:bCs/>
         </w:rPr>
         <w:t>Modifier le nom d’hôte :</w:t>
       </w:r>
     </w:p>
     <w:p>
-      <w:pPr>
-        <w:rPr>
-          <w:lang w:val="fr-BE"/>
-        </w:rPr>
-      </w:pPr>
-      <w:r>
-        <w:rPr>
-          <w:lang w:val="fr-BE"/>
-        </w:rPr>
+      <w:r>
         <w:t>Hostname (config) #hostname NAME</w:t>
       </w:r>
     </w:p>
@@ -2865,7 +3387,7 @@
       <w:pPr>
         <w:pStyle w:val="Titre2"/>
       </w:pPr>
-      <w:bookmarkStart w:id="2" w:name="_Toc223597168"/>
+      <w:bookmarkStart w:id="2" w:name="_Toc223795630"/>
       <w:r>
         <w:t>Save</w:t>
       </w:r>
@@ -2894,7 +3416,7 @@
       <w:pPr>
         <w:pStyle w:val="Titre2"/>
       </w:pPr>
-      <w:bookmarkStart w:id="3" w:name="_Toc223597169"/>
+      <w:bookmarkStart w:id="3" w:name="_Toc223795631"/>
       <w:r>
         <w:t>Switch Reset</w:t>
       </w:r>
@@ -2919,7 +3441,7 @@
       <w:pPr>
         <w:pStyle w:val="Titre2"/>
       </w:pPr>
-      <w:bookmarkStart w:id="4" w:name="_Toc223597170"/>
+      <w:bookmarkStart w:id="4" w:name="_Toc223795632"/>
       <w:r>
         <w:t>Router Reset</w:t>
       </w:r>
@@ -2939,7 +3461,7 @@
       <w:pPr>
         <w:pStyle w:val="Titre2"/>
       </w:pPr>
-      <w:bookmarkStart w:id="5" w:name="_Toc223597171"/>
+      <w:bookmarkStart w:id="5" w:name="_Toc223795633"/>
       <w:r>
         <w:t>Aliases</w:t>
       </w:r>
@@ -2954,7 +3476,7 @@
       <w:pPr>
         <w:pStyle w:val="Titre2"/>
       </w:pPr>
-      <w:bookmarkStart w:id="6" w:name="_Toc223597172"/>
+      <w:bookmarkStart w:id="6" w:name="_Toc223795634"/>
       <w:r>
         <w:t>Static &amp; Default Routes</w:t>
       </w:r>
@@ -2984,7 +3506,7 @@
       <w:pPr>
         <w:pStyle w:val="Titre2"/>
       </w:pPr>
-      <w:bookmarkStart w:id="7" w:name="_Toc223597173"/>
+      <w:bookmarkStart w:id="7" w:name="_Toc223795635"/>
       <w:r>
         <w:t>Loopback Interface</w:t>
       </w:r>
@@ -3033,7 +3555,7 @@
       <w:pPr>
         <w:pStyle w:val="Titre1"/>
       </w:pPr>
-      <w:bookmarkStart w:id="8" w:name="_Toc223597174"/>
+      <w:bookmarkStart w:id="8" w:name="_Toc223795636"/>
       <w:r>
         <w:lastRenderedPageBreak/>
         <w:t>IPv6 Configuration</w:t>
@@ -3275,7 +3797,7 @@
           <w:lang w:val="fr-BE"/>
         </w:rPr>
       </w:pPr>
-      <w:bookmarkStart w:id="9" w:name="_Toc223597175"/>
+      <w:bookmarkStart w:id="9" w:name="_Toc223795637"/>
       <w:r>
         <w:rPr>
           <w:lang w:val="fr-BE"/>
@@ -3292,7 +3814,7 @@
           <w:lang w:val="fr-BE"/>
         </w:rPr>
       </w:pPr>
-      <w:bookmarkStart w:id="10" w:name="_Toc223597176"/>
+      <w:bookmarkStart w:id="10" w:name="_Toc223795638"/>
       <w:r>
         <w:rPr>
           <w:lang w:val="fr-BE"/>
@@ -3362,7 +3884,7 @@
           <w:lang w:val="fr-BE"/>
         </w:rPr>
       </w:pPr>
-      <w:bookmarkStart w:id="11" w:name="_Toc223597177"/>
+      <w:bookmarkStart w:id="11" w:name="_Toc223795639"/>
       <w:r>
         <w:rPr>
           <w:lang w:val="fr-BE"/>
@@ -3565,7 +4087,7 @@
       <w:pPr>
         <w:pStyle w:val="Titre1"/>
       </w:pPr>
-      <w:bookmarkStart w:id="12" w:name="_Toc223597178"/>
+      <w:bookmarkStart w:id="12" w:name="_Toc223795640"/>
       <w:r>
         <w:lastRenderedPageBreak/>
         <w:t>VLAN</w:t>
@@ -3579,7 +4101,7 @@
           <w:lang w:val="fr-BE"/>
         </w:rPr>
       </w:pPr>
-      <w:bookmarkStart w:id="13" w:name="_Toc223597179"/>
+      <w:bookmarkStart w:id="13" w:name="_Toc223795641"/>
       <w:r>
         <w:rPr>
           <w:lang w:val="fr-BE"/>
@@ -3763,7 +4285,7 @@
       <w:pPr>
         <w:pStyle w:val="Titre2"/>
       </w:pPr>
-      <w:bookmarkStart w:id="14" w:name="_Toc223597180"/>
+      <w:bookmarkStart w:id="14" w:name="_Toc223795642"/>
       <w:r>
         <w:t>Trunk Configuration</w:t>
       </w:r>
@@ -3862,7 +4384,7 @@
       <w:pPr>
         <w:pStyle w:val="Titre3"/>
       </w:pPr>
-      <w:bookmarkStart w:id="15" w:name="_Toc223597181"/>
+      <w:bookmarkStart w:id="15" w:name="_Toc223795643"/>
       <w:r>
         <w:t>Sub-Interface</w:t>
       </w:r>
@@ -3920,7 +4442,7 @@
           <w:lang w:val="fr-BE"/>
         </w:rPr>
       </w:pPr>
-      <w:bookmarkStart w:id="16" w:name="_Toc223597182"/>
+      <w:bookmarkStart w:id="16" w:name="_Toc223795644"/>
       <w:r>
         <w:rPr>
           <w:lang w:val="fr-BE"/>
@@ -4121,9 +4643,104 @@
       <w:pPr>
         <w:pStyle w:val="Titre2"/>
       </w:pPr>
-      <w:r>
+      <w:bookmarkStart w:id="17" w:name="_Toc223795645"/>
+      <w:r>
+        <w:t>Summarize on ABR</w:t>
+      </w:r>
+      <w:bookmarkEnd w:id="17"/>
+    </w:p>
+    <w:p>
+      <w:r>
+        <w:t>R1 (config) #</w:t>
+      </w:r>
+      <w:r>
+        <w:t>router ospf 1</w:t>
+      </w:r>
+      <w:r>
+        <w:br/>
+      </w:r>
+      <w:r>
+        <w:t>R1 (config-router) #</w:t>
+      </w:r>
+      <w:r>
+        <w:t>area 1 range 165.162.0.0 255.255.252.0</w:t>
+      </w:r>
+    </w:p>
+    <w:p>
+      <w:pPr>
+        <w:pStyle w:val="Titre2"/>
+      </w:pPr>
+      <w:bookmarkStart w:id="18" w:name="_Toc223795646"/>
+      <w:r>
+        <w:t>Summarize on ASBR</w:t>
+      </w:r>
+      <w:bookmarkEnd w:id="18"/>
+    </w:p>
+    <w:p>
+      <w:r>
+        <w:t>R1 (config) #</w:t>
+      </w:r>
+      <w:r>
+        <w:t>router ospf 1</w:t>
+      </w:r>
+    </w:p>
+    <w:p>
+      <w:r>
+        <w:t>R1 (config) #</w:t>
+      </w:r>
+      <w:r>
+        <w:t>router ospf 1</w:t>
+      </w:r>
+    </w:p>
+    <w:p>
+      <w:r>
+        <w:t>R1 (config</w:t>
+      </w:r>
+      <w:r>
+        <w:t>-router</w:t>
+      </w:r>
+      <w:r>
+        <w:t>) #</w:t>
+      </w:r>
+      <w:r>
+        <w:t>summary-address 165.167.0.0 255.255.252.0</w:t>
+      </w:r>
+    </w:p>
+    <w:p>
+      <w:pPr>
+        <w:rPr>
+          <w:rFonts w:asciiTheme="majorHAnsi" w:eastAsiaTheme="majorEastAsia" w:hAnsiTheme="majorHAnsi" w:cstheme="majorBidi"/>
+          <w:color w:val="0F4761" w:themeColor="accent1" w:themeShade="BF"/>
+          <w:sz w:val="32"/>
+          <w:szCs w:val="32"/>
+        </w:rPr>
+      </w:pPr>
+      <w:r>
+        <w:t>R1 (config</w:t>
+      </w:r>
+      <w:r>
+        <w:t>-router</w:t>
+      </w:r>
+      <w:r>
+        <w:t>) #</w:t>
+      </w:r>
+      <w:r>
+        <w:t>summary-address 165.167.4.0 255.255.255.0</w:t>
+      </w:r>
+      <w:r>
+        <w:br w:type="page"/>
+      </w:r>
+    </w:p>
+    <w:p>
+      <w:pPr>
+        <w:pStyle w:val="Titre2"/>
+      </w:pPr>
+      <w:bookmarkStart w:id="19" w:name="_Toc223795647"/>
+      <w:r>
+        <w:lastRenderedPageBreak/>
         <w:t>Virtual link</w:t>
       </w:r>
+      <w:bookmarkEnd w:id="19"/>
     </w:p>
     <w:p>
       <w:r>
@@ -4219,47 +4836,102 @@
       <w:pPr>
         <w:pStyle w:val="Titre2"/>
       </w:pPr>
+      <w:bookmarkStart w:id="20" w:name="_Toc223795648"/>
       <w:r>
         <w:t>Stub a</w:t>
       </w:r>
       <w:r>
         <w:t>rea</w:t>
       </w:r>
-    </w:p>
-    <w:p>
-      <w:pPr>
-        <w:rPr>
-          <w:lang w:val="fr-BE"/>
-        </w:rPr>
-      </w:pPr>
-      <w:r>
-        <w:rPr>
-          <w:lang w:val="fr-BE"/>
-        </w:rPr>
+      <w:bookmarkEnd w:id="20"/>
+    </w:p>
+    <w:p>
+      <w:r>
+        <w:t>R1 (config) #router ospf 1</w:t>
+      </w:r>
+    </w:p>
+    <w:p>
+      <w:pPr>
+        <w:rPr>
+          <w:b/>
+          <w:bCs/>
+          <w:lang w:val="fr-BE"/>
+        </w:rPr>
+      </w:pPr>
+      <w:r>
+        <w:rPr>
+          <w:b/>
+          <w:bCs/>
+          <w:lang w:val="fr-BE"/>
+        </w:rPr>
+        <w:t>Sur tous les routeurs de la zone :</w:t>
+      </w:r>
+    </w:p>
+    <w:p>
+      <w:pPr>
+        <w:rPr>
+          <w:lang w:val="fr-BE"/>
+        </w:rPr>
+      </w:pPr>
+      <w:r>
+        <w:rPr>
+          <w:lang w:val="fr-BE"/>
+        </w:rPr>
+        <w:t>R1 (config-router) #area 4 stub</w:t>
+      </w:r>
+    </w:p>
+    <w:p>
+      <w:pPr>
+        <w:rPr>
+          <w:b/>
+          <w:bCs/>
+          <w:lang w:val="fr-BE"/>
+        </w:rPr>
+      </w:pPr>
+      <w:r>
+        <w:rPr>
+          <w:b/>
+          <w:bCs/>
+          <w:lang w:val="fr-BE"/>
+        </w:rPr>
+        <w:t>Assigner le réseau à la zone :</w:t>
+      </w:r>
+    </w:p>
+    <w:p>
+      <w:r>
+        <w:t>R1(config-router)</w:t>
+      </w:r>
+      <w:r>
+        <w:t xml:space="preserve"> </w:t>
+      </w:r>
+      <w:r>
+        <w:t>#network 165.164.0.0 0.0.0.255 area 4</w:t>
+      </w:r>
+    </w:p>
+    <w:p>
+      <w:pPr>
+        <w:pStyle w:val="Titre2"/>
+      </w:pPr>
+      <w:bookmarkStart w:id="21" w:name="_Toc223795649"/>
+      <w:r>
+        <w:t>Totally stubby area</w:t>
+      </w:r>
+      <w:bookmarkEnd w:id="21"/>
+    </w:p>
+    <w:p>
+      <w:r>
         <w:t>R1</w:t>
       </w:r>
       <w:r>
-        <w:rPr>
-          <w:lang w:val="fr-BE"/>
-        </w:rPr>
-        <w:t xml:space="preserve"> </w:t>
-      </w:r>
-      <w:r>
-        <w:rPr>
-          <w:lang w:val="fr-BE"/>
-        </w:rPr>
+        <w:t xml:space="preserve"> </w:t>
+      </w:r>
+      <w:r>
         <w:t>(config)</w:t>
       </w:r>
       <w:r>
-        <w:rPr>
-          <w:lang w:val="fr-BE"/>
-        </w:rPr>
-        <w:t xml:space="preserve"> </w:t>
-      </w:r>
-      <w:r>
-        <w:rPr>
-          <w:lang w:val="fr-BE"/>
-        </w:rPr>
+        <w:t xml:space="preserve"> </w:t>
+      </w:r>
+      <w:r>
         <w:t>#router ospf 1</w:t>
       </w:r>
     </w:p>
@@ -4277,10 +4949,167 @@
           <w:bCs/>
           <w:lang w:val="fr-BE"/>
         </w:rPr>
+        <w:t>Sur le routeur ABR :</w:t>
+      </w:r>
+    </w:p>
+    <w:p>
+      <w:pPr>
+        <w:rPr>
+          <w:lang w:val="fr-BE"/>
+        </w:rPr>
+      </w:pPr>
+      <w:r>
+        <w:rPr>
+          <w:lang w:val="fr-BE"/>
+        </w:rPr>
+        <w:t>R1 (config-router) #area 3 stub no-summary</w:t>
+      </w:r>
+    </w:p>
+    <w:p>
+      <w:pPr>
+        <w:rPr>
+          <w:b/>
+          <w:bCs/>
+          <w:lang w:val="fr-BE"/>
+        </w:rPr>
+      </w:pPr>
+      <w:r>
+        <w:rPr>
+          <w:b/>
+          <w:bCs/>
+          <w:lang w:val="fr-BE"/>
+        </w:rPr>
+        <w:t>Sur les autres :</w:t>
+      </w:r>
+    </w:p>
+    <w:p>
+      <w:pPr>
+        <w:rPr>
+          <w:lang w:val="fr-BE"/>
+        </w:rPr>
+      </w:pPr>
+      <w:r>
+        <w:rPr>
+          <w:lang w:val="fr-BE"/>
+        </w:rPr>
+        <w:t>R1 (config-router) #area 3 stub</w:t>
+      </w:r>
+    </w:p>
+    <w:p>
+      <w:pPr>
+        <w:rPr>
+          <w:b/>
+          <w:bCs/>
+          <w:lang w:val="fr-BE"/>
+        </w:rPr>
+      </w:pPr>
+      <w:r>
+        <w:rPr>
+          <w:b/>
+          <w:bCs/>
+          <w:lang w:val="fr-BE"/>
+        </w:rPr>
+        <w:t>Assigner le réseau à la zone :</w:t>
+      </w:r>
+    </w:p>
+    <w:p>
+      <w:r>
+        <w:t>R1</w:t>
+      </w:r>
+      <w:r>
+        <w:t xml:space="preserve"> </w:t>
+      </w:r>
+      <w:r>
+        <w:t>(config-router)</w:t>
+      </w:r>
+      <w:r>
+        <w:t xml:space="preserve"> </w:t>
+      </w:r>
+      <w:r>
+        <w:t xml:space="preserve">#network 165.164.0.0 0.0.0.255 area </w:t>
+      </w:r>
+      <w:r>
+        <w:t>3</w:t>
+      </w:r>
+    </w:p>
+    <w:p>
+      <w:pPr>
+        <w:pStyle w:val="Titre2"/>
+      </w:pPr>
+      <w:bookmarkStart w:id="22" w:name="_Toc223795650"/>
+      <w:r>
+        <w:t>NSSA</w:t>
+      </w:r>
+      <w:r>
+        <w:t xml:space="preserve"> area</w:t>
+      </w:r>
+      <w:bookmarkEnd w:id="22"/>
+    </w:p>
+    <w:p>
+      <w:r>
+        <w:t>R1</w:t>
+      </w:r>
+      <w:r>
+        <w:t xml:space="preserve"> </w:t>
+      </w:r>
+      <w:r>
+        <w:t>(config)</w:t>
+      </w:r>
+      <w:r>
+        <w:t xml:space="preserve"> </w:t>
+      </w:r>
+      <w:r>
+        <w:t>#router ospf 1</w:t>
+      </w:r>
+    </w:p>
+    <w:p>
+      <w:pPr>
+        <w:rPr>
+          <w:b/>
+          <w:bCs/>
+          <w:lang w:val="fr-BE"/>
+        </w:rPr>
+      </w:pPr>
+      <w:r>
+        <w:rPr>
+          <w:b/>
+          <w:bCs/>
+          <w:lang w:val="fr-BE"/>
+        </w:rPr>
         <w:t>Sur tous les routeurs de la zone :</w:t>
       </w:r>
     </w:p>
     <w:p>
+      <w:pPr>
+        <w:rPr>
+          <w:lang w:val="fr-BE"/>
+        </w:rPr>
+      </w:pPr>
+      <w:r>
+        <w:rPr>
+          <w:lang w:val="fr-BE"/>
+        </w:rPr>
+        <w:t>R1 (config-router) #area 4 nssa</w:t>
+      </w:r>
+    </w:p>
+    <w:p>
+      <w:pPr>
+        <w:rPr>
+          <w:b/>
+          <w:bCs/>
+          <w:lang w:val="fr-BE"/>
+        </w:rPr>
+      </w:pPr>
+      <w:r>
+        <w:rPr>
+          <w:b/>
+          <w:bCs/>
+          <w:lang w:val="fr-BE"/>
+        </w:rPr>
+        <w:t>Assigner le réseau à la zone :</w:t>
+      </w:r>
+    </w:p>
+    <w:p>
       <w:r>
         <w:t>R1</w:t>
       </w:r>
@@ -4294,13 +5123,204 @@
         <w:t xml:space="preserve"> </w:t>
       </w:r>
       <w:r>
-        <w:t xml:space="preserve">#area 4 </w:t>
-      </w:r>
-      <w:r>
-        <w:t>st</w:t>
-      </w:r>
-      <w:r>
-        <w:t>ub</w:t>
+        <w:t>#network 165.164.0.0 0.0.0.255 area 4</w:t>
+      </w:r>
+    </w:p>
+    <w:p>
+      <w:pPr>
+        <w:rPr>
+          <w:b/>
+          <w:bCs/>
+        </w:rPr>
+      </w:pPr>
+      <w:r>
+        <w:rPr>
+          <w:b/>
+          <w:bCs/>
+        </w:rPr>
+        <w:t>Sur le ASBR :</w:t>
+      </w:r>
+    </w:p>
+    <w:p>
+      <w:r>
+        <w:t xml:space="preserve">R1 (config-router) #redistribute </w:t>
+      </w:r>
+      <w:r>
+        <w:t>(</w:t>
+      </w:r>
+      <w:r>
+        <w:t>eigrp 50</w:t>
+      </w:r>
+      <w:r>
+        <w:t>/rip subnets)</w:t>
+      </w:r>
+      <w:r>
+        <w:t xml:space="preserve"> metric … metric-type (1/2)</w:t>
+      </w:r>
+    </w:p>
+    <w:p>
+      <w:pPr>
+        <w:rPr>
+          <w:i/>
+          <w:iCs/>
+          <w:lang w:val="fr-BE"/>
+        </w:rPr>
+      </w:pPr>
+      <w:r>
+        <w:rPr>
+          <w:i/>
+          <w:iCs/>
+          <w:lang w:val="fr-BE"/>
+        </w:rPr>
+        <w:t xml:space="preserve">Comment : faire la même chose sur l’autre protocole donc par exemple dans le routeur eigrp mettre </w:t>
+      </w:r>
+      <w:r>
+        <w:rPr>
+          <w:i/>
+          <w:iCs/>
+          <w:lang w:val="fr-BE"/>
+        </w:rPr>
+        <w:t>« </w:t>
+      </w:r>
+      <w:r>
+        <w:rPr>
+          <w:i/>
+          <w:iCs/>
+          <w:lang w:val="fr-BE"/>
+        </w:rPr>
+        <w:t>redistribute ospf 1 metric 10000 100 255 1 1500</w:t>
+      </w:r>
+      <w:r>
+        <w:rPr>
+          <w:i/>
+          <w:iCs/>
+          <w:lang w:val="fr-BE"/>
+        </w:rPr>
+        <w:t> »</w:t>
+      </w:r>
+    </w:p>
+    <w:p>
+      <w:pPr>
+        <w:pStyle w:val="Titre2"/>
+      </w:pPr>
+      <w:bookmarkStart w:id="23" w:name="_Toc223795651"/>
+      <w:r>
+        <w:t>Totally NSSA area</w:t>
+      </w:r>
+      <w:bookmarkEnd w:id="23"/>
+    </w:p>
+    <w:p>
+      <w:r>
+        <w:t>R1</w:t>
+      </w:r>
+      <w:r>
+        <w:t xml:space="preserve"> </w:t>
+      </w:r>
+      <w:r>
+        <w:t>(config)</w:t>
+      </w:r>
+      <w:r>
+        <w:t xml:space="preserve"> </w:t>
+      </w:r>
+      <w:r>
+        <w:t>#router ospf 1</w:t>
+      </w:r>
+    </w:p>
+    <w:p>
+      <w:pPr>
+        <w:rPr>
+          <w:b/>
+          <w:bCs/>
+          <w:lang w:val="fr-BE"/>
+        </w:rPr>
+      </w:pPr>
+      <w:r>
+        <w:rPr>
+          <w:b/>
+          <w:bCs/>
+          <w:lang w:val="fr-BE"/>
+        </w:rPr>
+        <w:t>Sur le routeur ABR :</w:t>
+      </w:r>
+    </w:p>
+    <w:p>
+      <w:pPr>
+        <w:rPr>
+          <w:lang w:val="fr-BE"/>
+        </w:rPr>
+      </w:pPr>
+      <w:r>
+        <w:rPr>
+          <w:lang w:val="fr-BE"/>
+        </w:rPr>
+        <w:lastRenderedPageBreak/>
+        <w:t>R1 (config-router) #area 5 nssa no-summary</w:t>
+      </w:r>
+    </w:p>
+    <w:p>
+      <w:pPr>
+        <w:rPr>
+          <w:b/>
+          <w:bCs/>
+          <w:lang w:val="fr-BE"/>
+        </w:rPr>
+      </w:pPr>
+      <w:r>
+        <w:rPr>
+          <w:b/>
+          <w:bCs/>
+          <w:lang w:val="fr-BE"/>
+        </w:rPr>
+        <w:t>Sur les autres :</w:t>
+      </w:r>
+    </w:p>
+    <w:p>
+      <w:pPr>
+        <w:rPr>
+          <w:lang w:val="fr-BE"/>
+        </w:rPr>
+      </w:pPr>
+      <w:r>
+        <w:rPr>
+          <w:lang w:val="fr-BE"/>
+        </w:rPr>
+        <w:t>R1</w:t>
+      </w:r>
+      <w:r>
+        <w:rPr>
+          <w:lang w:val="fr-BE"/>
+        </w:rPr>
+        <w:t xml:space="preserve"> </w:t>
+      </w:r>
+      <w:r>
+        <w:rPr>
+          <w:lang w:val="fr-BE"/>
+        </w:rPr>
+        <w:t>(config-router)</w:t>
+      </w:r>
+      <w:r>
+        <w:rPr>
+          <w:lang w:val="fr-BE"/>
+        </w:rPr>
+        <w:t xml:space="preserve"> </w:t>
+      </w:r>
+      <w:r>
+        <w:rPr>
+          <w:lang w:val="fr-BE"/>
+        </w:rPr>
+        <w:t xml:space="preserve">#area </w:t>
+      </w:r>
+      <w:r>
+        <w:rPr>
+          <w:lang w:val="fr-BE"/>
+        </w:rPr>
+        <w:t>5</w:t>
+      </w:r>
+      <w:r>
+        <w:rPr>
+          <w:lang w:val="fr-BE"/>
+        </w:rPr>
+        <w:t xml:space="preserve"> nssa</w:t>
       </w:r>
     </w:p>
     <w:p>
@@ -4322,244 +5342,16 @@
     </w:p>
     <w:p>
       <w:r>
-        <w:lastRenderedPageBreak/>
         <w:t>R1(config-router)</w:t>
       </w:r>
       <w:r>
         <w:t xml:space="preserve"> </w:t>
       </w:r>
       <w:r>
-        <w:t>#network 165.164.0.0 0.0.0.255 area 4</w:t>
-      </w:r>
-    </w:p>
-    <w:p>
-      <w:pPr>
-        <w:pStyle w:val="Titre2"/>
-      </w:pPr>
-      <w:r>
-        <w:t>Totally stubby area</w:t>
-      </w:r>
-    </w:p>
-    <w:p>
-      <w:r>
-        <w:t>R1</w:t>
-      </w:r>
-      <w:r>
-        <w:t xml:space="preserve"> </w:t>
-      </w:r>
-      <w:r>
-        <w:t>(config)</w:t>
-      </w:r>
-      <w:r>
-        <w:t xml:space="preserve"> </w:t>
-      </w:r>
-      <w:r>
-        <w:t>#router ospf 1</w:t>
-      </w:r>
-    </w:p>
-    <w:p>
-      <w:pPr>
-        <w:rPr>
-          <w:b/>
-          <w:bCs/>
-        </w:rPr>
-      </w:pPr>
-      <w:r>
-        <w:rPr>
-          <w:b/>
-          <w:bCs/>
-        </w:rPr>
-        <w:t>Sur le routeur ABR :</w:t>
-      </w:r>
-    </w:p>
-    <w:p>
-      <w:r>
-        <w:t xml:space="preserve">R1 (config-router) #area </w:t>
-      </w:r>
-      <w:r>
-        <w:t>3</w:t>
-      </w:r>
-      <w:r>
-        <w:t xml:space="preserve"> </w:t>
-      </w:r>
-      <w:r>
-        <w:t>stub no-summary</w:t>
-      </w:r>
-    </w:p>
-    <w:p>
-      <w:pPr>
-        <w:rPr>
-          <w:b/>
-          <w:bCs/>
-        </w:rPr>
-      </w:pPr>
-      <w:r>
-        <w:rPr>
-          <w:b/>
-          <w:bCs/>
-        </w:rPr>
-        <w:t>Sur le</w:t>
-      </w:r>
-      <w:r>
-        <w:rPr>
-          <w:b/>
-          <w:bCs/>
-        </w:rPr>
-        <w:t>s autres</w:t>
-      </w:r>
-      <w:r>
-        <w:rPr>
-          <w:b/>
-          <w:bCs/>
-        </w:rPr>
-        <w:t xml:space="preserve"> :</w:t>
-      </w:r>
-    </w:p>
-    <w:p>
-      <w:r>
-        <w:t xml:space="preserve">R1 (config-router) #area </w:t>
-      </w:r>
-      <w:r>
-        <w:t>3</w:t>
-      </w:r>
-      <w:r>
-        <w:t xml:space="preserve"> </w:t>
-      </w:r>
-      <w:r>
-        <w:t>stub</w:t>
-      </w:r>
-    </w:p>
-    <w:p>
-      <w:pPr>
-        <w:rPr>
-          <w:b/>
-          <w:bCs/>
-          <w:lang w:val="fr-BE"/>
-        </w:rPr>
-      </w:pPr>
-      <w:r>
-        <w:rPr>
-          <w:b/>
-          <w:bCs/>
-          <w:lang w:val="fr-BE"/>
-        </w:rPr>
-        <w:t>Assigner le réseau à la zone :</w:t>
-      </w:r>
-    </w:p>
-    <w:p>
-      <w:r>
-        <w:t>R1</w:t>
-      </w:r>
-      <w:r>
-        <w:t xml:space="preserve"> </w:t>
-      </w:r>
-      <w:r>
-        <w:t>(config-router)</w:t>
-      </w:r>
-      <w:r>
-        <w:t xml:space="preserve"> </w:t>
-      </w:r>
-      <w:r>
         <w:t xml:space="preserve">#network 165.164.0.0 0.0.0.255 area </w:t>
       </w:r>
       <w:r>
-        <w:t>3</w:t>
-      </w:r>
-    </w:p>
-    <w:p>
-      <w:pPr>
-        <w:pStyle w:val="Titre2"/>
-      </w:pPr>
-      <w:r>
-        <w:t>NSSA</w:t>
-      </w:r>
-      <w:r>
-        <w:t xml:space="preserve"> area</w:t>
-      </w:r>
-    </w:p>
-    <w:p>
-      <w:r>
-        <w:t>R1</w:t>
-      </w:r>
-      <w:r>
-        <w:t xml:space="preserve"> </w:t>
-      </w:r>
-      <w:r>
-        <w:t>(config)</w:t>
-      </w:r>
-      <w:r>
-        <w:t xml:space="preserve"> </w:t>
-      </w:r>
-      <w:r>
-        <w:t>#router ospf 1</w:t>
-      </w:r>
-    </w:p>
-    <w:p>
-      <w:pPr>
-        <w:rPr>
-          <w:b/>
-          <w:bCs/>
-          <w:lang w:val="fr-BE"/>
-        </w:rPr>
-      </w:pPr>
-      <w:r>
-        <w:rPr>
-          <w:b/>
-          <w:bCs/>
-          <w:lang w:val="fr-BE"/>
-        </w:rPr>
-        <w:t>Sur tous les routeurs de la zone :</w:t>
-      </w:r>
-    </w:p>
-    <w:p>
-      <w:r>
-        <w:t>R1</w:t>
-      </w:r>
-      <w:r>
-        <w:t xml:space="preserve"> </w:t>
-      </w:r>
-      <w:r>
-        <w:t>(config-router)</w:t>
-      </w:r>
-      <w:r>
-        <w:t xml:space="preserve"> </w:t>
-      </w:r>
-      <w:r>
-        <w:t>#area 4 nssa</w:t>
-      </w:r>
-    </w:p>
-    <w:p>
-      <w:pPr>
-        <w:rPr>
-          <w:b/>
-          <w:bCs/>
-          <w:lang w:val="fr-BE"/>
-        </w:rPr>
-      </w:pPr>
-      <w:r>
-        <w:rPr>
-          <w:b/>
-          <w:bCs/>
-          <w:lang w:val="fr-BE"/>
-        </w:rPr>
-        <w:t>Assigner le réseau à la zone :</w:t>
-      </w:r>
-    </w:p>
-    <w:p>
-      <w:r>
-        <w:t>R1</w:t>
-      </w:r>
-      <w:r>
-        <w:t xml:space="preserve"> </w:t>
-      </w:r>
-      <w:r>
-        <w:t>(config-router)</w:t>
-      </w:r>
-      <w:r>
-        <w:t xml:space="preserve"> </w:t>
-      </w:r>
-      <w:r>
-        <w:t>#network 165.164.0.0 0.0.0.255 area 4</w:t>
+        <w:t>5</w:t>
       </w:r>
     </w:p>
     <w:p>
@@ -4579,214 +5371,67 @@
     </w:p>
     <w:p>
       <w:r>
-        <w:t xml:space="preserve">R1 (config-router) #redistribute </w:t>
-      </w:r>
-      <w:r>
-        <w:t>(</w:t>
-      </w:r>
-      <w:r>
-        <w:t>eigrp 50</w:t>
-      </w:r>
-      <w:r>
-        <w:t>/rip subnets)</w:t>
-      </w:r>
-      <w:r>
-        <w:t xml:space="preserve"> metric … metric-type (1/2)</w:t>
-      </w:r>
-    </w:p>
-    <w:p>
-      <w:pPr>
-        <w:pStyle w:val="Titre2"/>
-      </w:pPr>
-      <w:r>
-        <w:t xml:space="preserve">Totally </w:t>
-      </w:r>
-      <w:r>
-        <w:t>NSSA area</w:t>
-      </w:r>
-    </w:p>
-    <w:p>
-      <w:r>
-        <w:t>R1</w:t>
-      </w:r>
-      <w:r>
-        <w:t xml:space="preserve"> </w:t>
-      </w:r>
-      <w:r>
-        <w:t>(config)</w:t>
-      </w:r>
-      <w:r>
-        <w:t xml:space="preserve"> </w:t>
-      </w:r>
-      <w:r>
-        <w:t>#router ospf 1</w:t>
-      </w:r>
-    </w:p>
-    <w:p>
-      <w:pPr>
-        <w:rPr>
-          <w:b/>
-          <w:bCs/>
-          <w:lang w:val="fr-BE"/>
-        </w:rPr>
-      </w:pPr>
-      <w:r>
-        <w:rPr>
-          <w:b/>
-          <w:bCs/>
-          <w:lang w:val="fr-BE"/>
-        </w:rPr>
-        <w:t>Sur le routeur ABR :</w:t>
-      </w:r>
-    </w:p>
-    <w:p>
-      <w:r>
-        <w:t>R1</w:t>
-      </w:r>
-      <w:r>
-        <w:t xml:space="preserve"> </w:t>
-      </w:r>
-      <w:r>
-        <w:t>(config-router)</w:t>
-      </w:r>
-      <w:r>
-        <w:t xml:space="preserve"> </w:t>
-      </w:r>
-      <w:r>
-        <w:t xml:space="preserve">#area </w:t>
-      </w:r>
-      <w:r>
-        <w:t>5</w:t>
-      </w:r>
-      <w:r>
-        <w:t xml:space="preserve"> </w:t>
-      </w:r>
-      <w:r>
-        <w:t>nssa</w:t>
-      </w:r>
-      <w:r>
-        <w:t xml:space="preserve"> no-summary</w:t>
-      </w:r>
-    </w:p>
-    <w:p>
-      <w:pPr>
-        <w:rPr>
-          <w:b/>
-          <w:bCs/>
-          <w:lang w:val="fr-BE"/>
-        </w:rPr>
-      </w:pPr>
-      <w:r>
-        <w:rPr>
-          <w:b/>
-          <w:bCs/>
-          <w:lang w:val="fr-BE"/>
-        </w:rPr>
-        <w:t>Sur les autres :</w:t>
-      </w:r>
-    </w:p>
-    <w:p>
-      <w:pPr>
-        <w:rPr>
-          <w:lang w:val="fr-BE"/>
-        </w:rPr>
-      </w:pPr>
-      <w:r>
-        <w:rPr>
-          <w:lang w:val="fr-BE"/>
-        </w:rPr>
-        <w:t>R1</w:t>
-      </w:r>
-      <w:r>
-        <w:rPr>
-          <w:lang w:val="fr-BE"/>
-        </w:rPr>
-        <w:t xml:space="preserve"> </w:t>
-      </w:r>
-      <w:r>
-        <w:rPr>
-          <w:lang w:val="fr-BE"/>
-        </w:rPr>
-        <w:t>(config-router)</w:t>
-      </w:r>
-      <w:r>
-        <w:rPr>
-          <w:lang w:val="fr-BE"/>
-        </w:rPr>
-        <w:t xml:space="preserve"> </w:t>
-      </w:r>
-      <w:r>
-        <w:rPr>
-          <w:lang w:val="fr-BE"/>
-        </w:rPr>
-        <w:t xml:space="preserve">#area </w:t>
-      </w:r>
-      <w:r>
-        <w:rPr>
-          <w:lang w:val="fr-BE"/>
-        </w:rPr>
-        <w:t>5</w:t>
-      </w:r>
-      <w:r>
-        <w:rPr>
-          <w:lang w:val="fr-BE"/>
-        </w:rPr>
-        <w:t xml:space="preserve"> nssa</w:t>
-      </w:r>
-    </w:p>
-    <w:p>
-      <w:pPr>
-        <w:rPr>
-          <w:b/>
-          <w:bCs/>
-          <w:lang w:val="fr-BE"/>
-        </w:rPr>
-      </w:pPr>
-      <w:r>
-        <w:rPr>
-          <w:b/>
-          <w:bCs/>
-          <w:lang w:val="fr-BE"/>
-        </w:rPr>
-        <w:t>Assigner le réseau à la zone :</w:t>
-      </w:r>
-    </w:p>
-    <w:p>
-      <w:r>
-        <w:t>R1(config-router)</w:t>
-      </w:r>
-      <w:r>
-        <w:t xml:space="preserve"> </w:t>
-      </w:r>
-      <w:r>
-        <w:t xml:space="preserve">#network 165.164.0.0 0.0.0.255 area </w:t>
-      </w:r>
-      <w:r>
-        <w:t>5</w:t>
-      </w:r>
-    </w:p>
-    <w:p>
-      <w:pPr>
-        <w:rPr>
-          <w:b/>
-          <w:bCs/>
-        </w:rPr>
-      </w:pPr>
-      <w:r>
-        <w:rPr>
-          <w:b/>
-          <w:bCs/>
-        </w:rPr>
-        <w:t>Sur le ASBR :</w:t>
-      </w:r>
-    </w:p>
-    <w:p>
-      <w:r>
         <w:t>R1 (config-router) #redistribute (eigrp 50/rip subnets) metric … metric-type (1/2)</w:t>
       </w:r>
     </w:p>
     <w:p>
-      <w:r>
+      <w:pPr>
+        <w:rPr>
+          <w:i/>
+          <w:iCs/>
+          <w:lang w:val="fr-BE"/>
+        </w:rPr>
+      </w:pPr>
+      <w:r>
+        <w:rPr>
+          <w:i/>
+          <w:iCs/>
+          <w:lang w:val="fr-BE"/>
+        </w:rPr>
+        <w:t xml:space="preserve">Comment : faire la même chose sur l’autre protocole donc par exemple dans le routeur eigrp mettre </w:t>
+      </w:r>
+      <w:r>
+        <w:rPr>
+          <w:i/>
+          <w:iCs/>
+          <w:lang w:val="fr-BE"/>
+        </w:rPr>
+        <w:t>« </w:t>
+      </w:r>
+      <w:r>
+        <w:rPr>
+          <w:i/>
+          <w:iCs/>
+          <w:lang w:val="fr-BE"/>
+        </w:rPr>
+        <w:t>redistribute ospf 1 metric 10000 100 255 1 1500</w:t>
+      </w:r>
+      <w:r>
+        <w:rPr>
+          <w:i/>
+          <w:iCs/>
+          <w:lang w:val="fr-BE"/>
+        </w:rPr>
+        <w:t> »</w:t>
+      </w:r>
+    </w:p>
+    <w:p>
+      <w:pPr>
+        <w:rPr>
+          <w:lang w:val="fr-BE"/>
+        </w:rPr>
+      </w:pPr>
+    </w:p>
+    <w:p>
+      <w:pPr>
+        <w:rPr>
+          <w:lang w:val="fr-BE"/>
+        </w:rPr>
+      </w:pPr>
+      <w:r>
+        <w:rPr>
+          <w:lang w:val="fr-BE"/>
+        </w:rPr>
         <w:br w:type="page"/>
       </w:r>
     </w:p>
@@ -4794,12 +5439,12 @@
       <w:pPr>
         <w:pStyle w:val="Titre1"/>
       </w:pPr>
-      <w:bookmarkStart w:id="17" w:name="_Toc223597183"/>
+      <w:bookmarkStart w:id="24" w:name="_Toc223795652"/>
       <w:r>
         <w:lastRenderedPageBreak/>
         <w:t>EIGRP Configuration</w:t>
       </w:r>
-      <w:bookmarkEnd w:id="17"/>
+      <w:bookmarkEnd w:id="24"/>
     </w:p>
     <w:p>
       <w:pPr>
@@ -4903,11 +5548,11 @@
       <w:pPr>
         <w:pStyle w:val="Titre2"/>
       </w:pPr>
-      <w:bookmarkStart w:id="18" w:name="_Toc223597184"/>
+      <w:bookmarkStart w:id="25" w:name="_Toc223795653"/>
       <w:r>
         <w:t>Key Configuration</w:t>
       </w:r>
-      <w:bookmarkEnd w:id="18"/>
+      <w:bookmarkEnd w:id="25"/>
     </w:p>
     <w:p>
       <w:r>
@@ -4967,7 +5612,7 @@
           <w:lang w:val="fr-BE"/>
         </w:rPr>
       </w:pPr>
-      <w:bookmarkStart w:id="19" w:name="_Toc223597185"/>
+      <w:bookmarkStart w:id="26" w:name="_Toc223795654"/>
       <w:r>
         <w:rPr>
           <w:lang w:val="fr-BE"/>
@@ -4980,7 +5625,7 @@
         </w:rPr>
         <w:t xml:space="preserve"> Configuration</w:t>
       </w:r>
-      <w:bookmarkEnd w:id="19"/>
+      <w:bookmarkEnd w:id="26"/>
     </w:p>
     <w:p>
       <w:pPr>
@@ -5448,14 +6093,14 @@
       <w:pPr>
         <w:pStyle w:val="Titre2"/>
       </w:pPr>
-      <w:bookmarkStart w:id="20" w:name="_Toc223597186"/>
+      <w:bookmarkStart w:id="27" w:name="_Toc223795655"/>
       <w:r>
         <w:t>IPv6</w:t>
       </w:r>
       <w:r>
         <w:t xml:space="preserve"> Configuration</w:t>
       </w:r>
-      <w:bookmarkEnd w:id="20"/>
+      <w:bookmarkEnd w:id="27"/>
     </w:p>
     <w:p>
       <w:pPr>
@@ -5482,12 +6127,14 @@
         <w:rPr>
           <w:b/>
           <w:bCs/>
-        </w:rPr>
-      </w:pPr>
-      <w:r>
-        <w:rPr>
-          <w:b/>
-          <w:bCs/>
+          <w:lang w:val="fr-BE"/>
+        </w:rPr>
+      </w:pPr>
+      <w:r>
+        <w:rPr>
+          <w:b/>
+          <w:bCs/>
+          <w:lang w:val="fr-BE"/>
         </w:rPr>
         <w:t>Configurer EIGRP :</w:t>
       </w:r>
@@ -5806,12 +6453,12 @@
       <w:pPr>
         <w:pStyle w:val="Titre2"/>
       </w:pPr>
-      <w:bookmarkStart w:id="21" w:name="_Toc223597187"/>
+      <w:bookmarkStart w:id="28" w:name="_Toc223795656"/>
       <w:r>
         <w:lastRenderedPageBreak/>
         <w:t>Named Configuration</w:t>
       </w:r>
-      <w:bookmarkEnd w:id="21"/>
+      <w:bookmarkEnd w:id="28"/>
     </w:p>
     <w:p>
       <w:r>
@@ -6634,7 +7281,7 @@
           <w:lang w:val="fr-BE"/>
         </w:rPr>
       </w:pPr>
-      <w:bookmarkStart w:id="22" w:name="_Toc223597188"/>
+      <w:bookmarkStart w:id="29" w:name="_Toc223795657"/>
       <w:r>
         <w:rPr>
           <w:lang w:val="fr-BE"/>
@@ -6642,7 +7289,7 @@
         <w:lastRenderedPageBreak/>
         <w:t>ACL Configuration</w:t>
       </w:r>
-      <w:bookmarkEnd w:id="22"/>
+      <w:bookmarkEnd w:id="29"/>
     </w:p>
     <w:p>
       <w:pPr>
@@ -6762,7 +7409,7 @@
         </w:rPr>
         <w:t>R1 (config-if) #ip access-group </w:t>
       </w:r>
-      <w:bookmarkStart w:id="23" w:name="_Hlk215728148"/>
+      <w:bookmarkStart w:id="30" w:name="_Hlk215728148"/>
       <w:r>
         <w:rPr>
           <w:lang w:val="en-US"/>
@@ -6797,7 +7444,7 @@
         </w:rPr>
         <w:t xml:space="preserve">} </w:t>
       </w:r>
-      <w:bookmarkEnd w:id="23"/>
+      <w:bookmarkEnd w:id="30"/>
       <w:r>
         <w:rPr>
           <w:lang w:val="en-US"/>
@@ -7022,11 +7669,11 @@
       <w:pPr>
         <w:pStyle w:val="Titre2"/>
       </w:pPr>
-      <w:bookmarkStart w:id="24" w:name="_Toc223597189"/>
+      <w:bookmarkStart w:id="31" w:name="_Toc223795658"/>
       <w:r>
         <w:t>Standard ACL</w:t>
       </w:r>
-      <w:bookmarkEnd w:id="24"/>
+      <w:bookmarkEnd w:id="31"/>
     </w:p>
     <w:p>
       <w:r>
@@ -7134,11 +7781,11 @@
           <w:tab w:val="left" w:pos="3240"/>
         </w:tabs>
       </w:pPr>
-      <w:bookmarkStart w:id="25" w:name="_Toc223597190"/>
+      <w:bookmarkStart w:id="32" w:name="_Toc223795659"/>
       <w:r>
         <w:t>Extended ACL</w:t>
       </w:r>
-      <w:bookmarkEnd w:id="25"/>
+      <w:bookmarkEnd w:id="32"/>
     </w:p>
     <w:p>
       <w:pPr>
@@ -7271,7 +7918,7 @@
           <w:lang w:val="fr-BE"/>
         </w:rPr>
       </w:pPr>
-      <w:bookmarkStart w:id="26" w:name="_Toc223597191"/>
+      <w:bookmarkStart w:id="33" w:name="_Toc223795660"/>
       <w:r>
         <w:rPr>
           <w:lang w:val="fr-BE"/>
@@ -7279,7 +7926,7 @@
         <w:lastRenderedPageBreak/>
         <w:t>NAT / PAT Configuration</w:t>
       </w:r>
-      <w:bookmarkEnd w:id="26"/>
+      <w:bookmarkEnd w:id="33"/>
     </w:p>
     <w:p>
       <w:pPr>
@@ -7338,14 +7985,14 @@
           <w:lang w:val="fr-BE"/>
         </w:rPr>
       </w:pPr>
-      <w:bookmarkStart w:id="27" w:name="_Toc223597192"/>
+      <w:bookmarkStart w:id="34" w:name="_Toc223795661"/>
       <w:r>
         <w:rPr>
           <w:lang w:val="fr-BE"/>
         </w:rPr>
         <w:t>Static NAT</w:t>
       </w:r>
-      <w:bookmarkEnd w:id="27"/>
+      <w:bookmarkEnd w:id="34"/>
     </w:p>
     <w:p>
       <w:pPr>
@@ -7473,14 +8120,14 @@
           <w:lang w:val="fr-BE"/>
         </w:rPr>
       </w:pPr>
-      <w:bookmarkStart w:id="28" w:name="_Toc223597193"/>
+      <w:bookmarkStart w:id="35" w:name="_Toc223795662"/>
       <w:r>
         <w:rPr>
           <w:lang w:val="fr-BE"/>
         </w:rPr>
         <w:t>Dynamic NAT</w:t>
       </w:r>
-      <w:bookmarkEnd w:id="28"/>
+      <w:bookmarkEnd w:id="35"/>
     </w:p>
     <w:p>
       <w:pPr>
@@ -7634,7 +8281,7 @@
           <w:lang w:val="fr-BE"/>
         </w:rPr>
       </w:pPr>
-      <w:bookmarkStart w:id="29" w:name="_Toc223597194"/>
+      <w:bookmarkStart w:id="36" w:name="_Toc223795663"/>
       <w:r>
         <w:rPr>
           <w:lang w:val="fr-BE"/>
@@ -7642,7 +8289,7 @@
         <w:lastRenderedPageBreak/>
         <w:t>PAT</w:t>
       </w:r>
-      <w:bookmarkEnd w:id="29"/>
+      <w:bookmarkEnd w:id="36"/>
     </w:p>
     <w:p>
       <w:pPr>
@@ -7856,12 +8503,12 @@
       <w:pPr>
         <w:pStyle w:val="Titre1"/>
       </w:pPr>
-      <w:bookmarkStart w:id="30" w:name="_Toc223597195"/>
+      <w:bookmarkStart w:id="37" w:name="_Toc223795664"/>
       <w:r>
         <w:lastRenderedPageBreak/>
         <w:t>CDP Configuration</w:t>
       </w:r>
-      <w:bookmarkEnd w:id="30"/>
+      <w:bookmarkEnd w:id="37"/>
     </w:p>
     <w:p>
       <w:r>
@@ -7995,11 +8642,11 @@
       <w:pPr>
         <w:pStyle w:val="Titre1"/>
       </w:pPr>
-      <w:bookmarkStart w:id="31" w:name="_Toc223597196"/>
+      <w:bookmarkStart w:id="38" w:name="_Toc223795665"/>
       <w:r>
         <w:t>LLDP Configuration</w:t>
       </w:r>
-      <w:bookmarkEnd w:id="31"/>
+      <w:bookmarkEnd w:id="38"/>
     </w:p>
     <w:p>
       <w:r>
@@ -8154,11 +8801,11 @@
       <w:pPr>
         <w:pStyle w:val="Titre1"/>
       </w:pPr>
-      <w:bookmarkStart w:id="32" w:name="_Toc223597197"/>
+      <w:bookmarkStart w:id="39" w:name="_Toc223795666"/>
       <w:r>
         <w:t>NTP Configuration</w:t>
       </w:r>
-      <w:bookmarkEnd w:id="32"/>
+      <w:bookmarkEnd w:id="39"/>
     </w:p>
     <w:p>
       <w:r>
@@ -8228,12 +8875,12 @@
       <w:pPr>
         <w:pStyle w:val="Titre1"/>
       </w:pPr>
-      <w:bookmarkStart w:id="33" w:name="_Toc223597198"/>
+      <w:bookmarkStart w:id="40" w:name="_Toc223795667"/>
       <w:r>
         <w:lastRenderedPageBreak/>
         <w:t>DHCP Configuration</w:t>
       </w:r>
-      <w:bookmarkEnd w:id="33"/>
+      <w:bookmarkEnd w:id="40"/>
     </w:p>
     <w:p>
       <w:r>
@@ -8263,14 +8910,14 @@
           <w:lang w:val="fr-BE"/>
         </w:rPr>
       </w:pPr>
-      <w:bookmarkStart w:id="34" w:name="_Toc223597199"/>
+      <w:bookmarkStart w:id="41" w:name="_Toc223795668"/>
       <w:r>
         <w:rPr>
           <w:lang w:val="fr-BE"/>
         </w:rPr>
         <w:t>DCHPv4</w:t>
       </w:r>
-      <w:bookmarkEnd w:id="34"/>
+      <w:bookmarkEnd w:id="41"/>
     </w:p>
     <w:p>
       <w:pPr>
@@ -8633,12 +9280,12 @@
       <w:pPr>
         <w:pStyle w:val="Titre2"/>
       </w:pPr>
-      <w:bookmarkStart w:id="35" w:name="_Toc223597200"/>
+      <w:bookmarkStart w:id="42" w:name="_Toc223795669"/>
       <w:r>
         <w:lastRenderedPageBreak/>
         <w:t>DHCPv6 Stateless</w:t>
       </w:r>
-      <w:bookmarkEnd w:id="35"/>
+      <w:bookmarkEnd w:id="42"/>
     </w:p>
     <w:p>
       <w:r>
@@ -8763,12 +9410,28 @@
       </w:r>
     </w:p>
     <w:p>
-      <w:r>
+      <w:pPr>
+        <w:rPr>
+          <w:lang w:val="fr-BE"/>
+        </w:rPr>
+      </w:pPr>
+      <w:r>
+        <w:rPr>
+          <w:lang w:val="fr-BE"/>
+        </w:rPr>
         <w:t>R1 (config-dhcpv6) #dns-server 2001:db8:acad:1::254</w:t>
       </w:r>
     </w:p>
     <w:p>
-      <w:r>
+      <w:pPr>
+        <w:rPr>
+          <w:lang w:val="fr-BE"/>
+        </w:rPr>
+      </w:pPr>
+      <w:r>
+        <w:rPr>
+          <w:lang w:val="fr-BE"/>
+        </w:rPr>
         <w:t>R1 (config-dhcpv6) #domain-name example.com</w:t>
       </w:r>
     </w:p>
@@ -8952,12 +9615,12 @@
       <w:pPr>
         <w:pStyle w:val="Titre2"/>
       </w:pPr>
-      <w:bookmarkStart w:id="36" w:name="_Toc223597201"/>
+      <w:bookmarkStart w:id="43" w:name="_Toc223795670"/>
       <w:r>
         <w:lastRenderedPageBreak/>
         <w:t>DHCPv6 Statefull</w:t>
       </w:r>
-      <w:bookmarkEnd w:id="36"/>
+      <w:bookmarkEnd w:id="43"/>
     </w:p>
     <w:p>
       <w:r>
@@ -9866,7 +10529,7 @@
   <w:style w:type="paragraph" w:default="1" w:styleId="Normal">
     <w:name w:val="Normal"/>
     <w:qFormat/>
-    <w:rsid w:val="008B6C5D"/>
+    <w:rsid w:val="00880838"/>
     <w:rPr>
       <w:lang w:val="en-GB"/>
     </w:rPr>

</xml_diff>